<commit_message>
HIT-32: bind screenshot commands to exact local source checkouts and final readback
</commit_message>
<xml_diff>
--- a/docs/labs/pr12/tp/reports/0104-pz01-tp.docx
+++ b/docs/labs/pr12/tp/reports/0104-pz01-tp.docx
@@ -2314,7 +2314,7 @@
         <w:br/>
         <w:t>STATE: SOURCE 4a2bfcdd9bf7656a8d5c55963750b8aecf186fb0</w:t>
         <w:br/>
-        <w:t>CWD: /Users/tima/Documents/Codex/2026-10-18/files-pasted-by-the-user-hitpipe/work/hitpipe</w:t>
+        <w:t>CWD: /Users/tima/Documents/Codex/2026-10-18/files-pasted-by-the-user-hitpipe/work/figure-source</w:t>
         <w:br/>
         <w:t>COMMAND: git show 4a2bfcdd9bf7656a8d5c55963750b8aecf186fb0:services/processing/cmd/processing-contractcheck/main.go</w:t>
         <w:br/>
@@ -2358,9 +2358,9 @@
         <w:br/>
         <w:t>STATE: PASS build 8ae5d67b9eb0f4ffc729a270c2ee14e1c052b0cb</w:t>
         <w:br/>
-        <w:t>CWD: /Users/tima/Documents/Codex/2026-10-18/files-pasted-by-the-user-hitpipe/work/hitpipe</w:t>
+        <w:t>CWD: /Users/tima/Documents/Codex/2026-10-18/files-pasted-by-the-user-hitpipe/work/figure-delivery</w:t>
         <w:br/>
-        <w:t>COMMAND: python3 tools/pr12/workspace.py build processing --mode dev --require; python3 tools/pr12/workspace.py build processing --mode release --require</w:t>
+        <w:t>COMMAND: export PATH=/Users/tima/Documents/Codex/2026-10-18/files-pasted-by-the-user-hitpipe/work/go/bin:$PATH; go version; git rev-parse HEAD; python3 tools/pr12/workspace.py build processing --mode dev --require; python3 tools/pr12/workspace.py build processing --mode release --require</w:t>
         <w:br/>
         <w:t>STEPS: 1. Открыть terminal exact source8ae5 и показать fullSHA/Go1.27.2. 2. Выполнить обе команды. 3. Раскрыть actual flags -N -l и -trimpath, linker metadata. 4. Показать exit0 каждого; размеры из delivery-observations.json.</w:t>
       </w:r>
@@ -2404,7 +2404,7 @@
         <w:br/>
         <w:t>CWD: repo root затем отдельный каталог вне checkout</w:t>
         <w:br/>
-        <w:t>COMMAND: python3 tools/pr12/workspace.py smoke processing --require</w:t>
+        <w:t>COMMAND: export PATH=/Users/tima/Documents/Codex/2026-10-18/files-pasted-by-the-user-hitpipe/work/go/bin:$PATH; python3 tools/pr12/workspace.py build processing --mode release --require; TP_DELIVERY_DIR=$(mktemp -d /tmp/tp-delivery.XXXXXX); cp .pr12-build/processing/release/processing-contractcheck services/processing/testdata/valid.json "$TP_DELIVERY_DIR/"; cd "$TP_DELIVERY_DIR"; pwd; ./processing-contractcheck --version; ./processing-contractcheck --fixture valid.json --format json; echo $?</w:t>
         <w:br/>
         <w:t>STEPS: 1. Выполнить smoke: он собирает оба режима и копирует binary+fixtures во временный каталог. 2. В выводе показать пути pr12-outside-checkout, invocation --version и --fixture. 3. Для ручной демонстрации скопировать release binary и valid.json в новый пустой каталог, перейти туда. 4. Запустить ./processing-contractcheck --version, затем --fixture valid.json --format json и echo $?.</w:t>
       </w:r>
@@ -2446,9 +2446,9 @@
         <w:br/>
         <w:t>STATE: PASS 8ae5d67b9eb0f4ffc729a270c2ee14e1c052b0cb</w:t>
         <w:br/>
-        <w:t>CWD: /Users/tima/Documents/Codex/2026-10-18/files-pasted-by-the-user-hitpipe/work/hitpipe</w:t>
+        <w:t>CWD: /Users/tima/Documents/Codex/2026-10-18/files-pasted-by-the-user-hitpipe/work/figure-delivery</w:t>
         <w:br/>
-        <w:t>COMMAND: .pr12-build/processing/release/processing-contractcheck --version; .pr12-build/processing/release/processing-contractcheck --fixture services/processing/testdata/valid.json --format json; echo $?</w:t>
+        <w:t>COMMAND: export PATH=/Users/tima/Documents/Codex/2026-10-18/files-pasted-by-the-user-hitpipe/work/go/bin:$PATH; go version; git rev-parse HEAD; .pr12-build/processing/release/processing-contractcheck --version; .pr12-build/processing/release/processing-contractcheck --fixture services/processing/testdata/valid.json --format json; echo $?</w:t>
         <w:br/>
         <w:t>STEPS: 1. Собрать release exact source как на рисунке2. 2. Выполнить указанные version и fixture команды. 3. Оставить start/result, VALID/FINANCIAL_ELIGIBILITY_ONLY и exit0 в кадре.</w:t>
       </w:r>
@@ -2490,9 +2490,9 @@
         <w:br/>
         <w:t>STATE: PASS expected error exit2 8ae5d67b9eb0f4ffc729a270c2ee14e1c052b0cb</w:t>
         <w:br/>
-        <w:t>CWD: /Users/tima/Documents/Codex/2026-10-18/files-pasted-by-the-user-hitpipe/work/hitpipe</w:t>
+        <w:t>CWD: /Users/tima/Documents/Codex/2026-10-18/files-pasted-by-the-user-hitpipe/work/figure-delivery</w:t>
         <w:br/>
-        <w:t>COMMAND: .pr12-build/processing/release/processing-contractcheck --fixture services/processing/testdata/invalid.json --format json; echo $?</w:t>
+        <w:t>COMMAND: export PATH=/Users/tima/Documents/Codex/2026-10-18/files-pasted-by-the-user-hitpipe/work/go/bin:$PATH; go version; git rev-parse HEAD; .pr12-build/processing/release/processing-contractcheck --fixture services/processing/testdata/invalid.json --format json; echo $?</w:t>
         <w:br/>
         <w:t>STEPS: 1. Использовать тот же binary/source что normal. 2. Выполнить invalid command без set -e, чтобы показать exit. 3. Повторить с --format invalid при valid fixture. 4. В обоих случаях должно быть понятное INVALID_JSON/CONFIGURATION и nonzero2, без payload.</w:t>
       </w:r>
@@ -2578,9 +2578,9 @@
         <w:br/>
         <w:t>STATE: PASS sensitivity: expected nonzero on M01; restored PASS</w:t>
         <w:br/>
-        <w:t>CWD: /Users/tima/Documents/Codex/2026-10-18/files-pasted-by-the-user-hitpipe/work/hitpipe</w:t>
+        <w:t>CWD: /Users/tima/Documents/Codex/2026-10-18/files-pasted-by-the-user-hitpipe/work/figure-source</w:t>
         <w:br/>
-        <w:t xml:space="preserve">COMMAND: python3 services/processing/tools/mutations/run.py --output .pr12-build/figure-mutations --natural-defects 1 --natural-defect-task </w:t>
+        <w:t xml:space="preserve">COMMAND: export PATH=/Users/tima/Documents/Codex/2026-10-18/files-pasted-by-the-user-hitpipe/work/go/bin:$PATH; go version; git rev-parse HEAD; python3 services/processing/tools/mutations/run.py --output .pr12-build/figure-mutations --natural-defects 1 --natural-defect-task </w:t>
       </w:r>
       <w:hyperlink r:id="rId15">
         <w:r>

</xml_diff>

<commit_message>
HIT-32: refresh reports against accepted parser fix and main evidence
</commit_message>
<xml_diff>
--- a/docs/labs/pr12/tp/reports/0104-pz01-tp.docx
+++ b/docs/labs/pr12/tp/reports/0104-pz01-tp.docx
@@ -481,8 +481,16 @@
             <w:vAlign w:val="center"/>
           </w:tcPr>
           <w:p>
-            <w:r>
-              <w:t>Студент гр. № (не предоставлена)</w:t>
+            <w:pPr>
+              <w:ind w:firstLine="0"/>
+            </w:pPr>
+            <w:r>
+              <w:rPr>
+                <w:sz w:val="24"/>
+              </w:rPr>
+              <w:t>гр. №</w:t>
+              <w:br/>
+              <w:t>не указана</w:t>
             </w:r>
           </w:p>
         </w:tc>
@@ -612,7 +620,13 @@
             <w:vAlign w:val="center"/>
           </w:tcPr>
           <w:p>
-            <w:r>
+            <w:pPr>
+              <w:ind w:firstLine="0"/>
+            </w:pPr>
+            <w:r>
+              <w:rPr>
+                <w:sz w:val="28"/>
+              </w:rPr>
               <w:t>Тимофей Патрушев</w:t>
             </w:r>
           </w:p>
@@ -820,7 +834,7 @@
     </w:p>
     <w:p>
       <w:r>
-        <w:t>Автор результата Тимофей Патрушев при помощи Codex. MANUAL_LAB_PR12; Processing — Operations Core. Контракты Candidate/In Review, grant отсутствует; formal admission и backend /start /review не выполнялись. Технические проверки фактические, человеческие действия и изображения ожидаются.</w:t>
+        <w:t>Автор — Тимофей Патрушев при помощи Codex. MANUAL_LAB_PR12. Инженерные PR приняты в main; принятие отчётного PR №10 и человеческие проверки ожидаются. Product/Architecture contracts сохраняют Candidate/In Review. Официальные /start и /review не вызывались.</w:t>
       </w:r>
     </w:p>
     <w:p>
@@ -854,7 +868,16 @@
             <w:tcW w:type="dxa" w:w="4677"/>
           </w:tcPr>
           <w:p>
-            <w:r>
+            <w:pPr>
+              <w:spacing w:line="240" w:lineRule="auto" w:after="60"/>
+              <w:ind w:firstLine="0"/>
+              <w:jc w:val="left"/>
+            </w:pPr>
+            <w:r>
+              <w:rPr>
+                <w:b/>
+                <w:sz w:val="24"/>
+              </w:rPr>
               <w:t>Поле</w:t>
             </w:r>
           </w:p>
@@ -864,7 +887,16 @@
             <w:tcW w:type="dxa" w:w="4677"/>
           </w:tcPr>
           <w:p>
-            <w:r>
+            <w:pPr>
+              <w:spacing w:line="240" w:lineRule="auto" w:after="60"/>
+              <w:ind w:firstLine="0"/>
+              <w:jc w:val="left"/>
+            </w:pPr>
+            <w:r>
+              <w:rPr>
+                <w:b/>
+                <w:sz w:val="24"/>
+              </w:rPr>
               <w:t>Значение</w:t>
             </w:r>
           </w:p>
@@ -879,8 +911,15 @@
             <w:tcW w:type="dxa" w:w="4677"/>
           </w:tcPr>
           <w:p>
-            <w:pPr/>
-            <w:r>
+            <w:pPr>
+              <w:spacing w:line="240" w:lineRule="auto" w:after="60"/>
+              <w:ind w:firstLine="0"/>
+              <w:jc w:val="left"/>
+            </w:pPr>
+            <w:r>
+              <w:rPr>
+                <w:sz w:val="24"/>
+              </w:rPr>
               <w:t>ФИО, группа</w:t>
             </w:r>
           </w:p>
@@ -890,8 +929,15 @@
             <w:tcW w:type="dxa" w:w="4677"/>
           </w:tcPr>
           <w:p>
-            <w:pPr/>
-            <w:r>
+            <w:pPr>
+              <w:spacing w:line="240" w:lineRule="auto" w:after="60"/>
+              <w:ind w:firstLine="0"/>
+              <w:jc w:val="left"/>
+            </w:pPr>
+            <w:r>
+              <w:rPr>
+                <w:sz w:val="24"/>
+              </w:rPr>
               <w:t>Тимофей Патрушев. Группа не предоставлена; заполняет участник</w:t>
             </w:r>
           </w:p>
@@ -906,8 +952,15 @@
             <w:tcW w:type="dxa" w:w="4677"/>
           </w:tcPr>
           <w:p>
-            <w:pPr/>
-            <w:r>
+            <w:pPr>
+              <w:spacing w:line="240" w:lineRule="auto" w:after="60"/>
+              <w:ind w:firstLine="0"/>
+              <w:jc w:val="left"/>
+            </w:pPr>
+            <w:r>
+              <w:rPr>
+                <w:sz w:val="24"/>
+              </w:rPr>
               <w:t>Проект и команда</w:t>
             </w:r>
           </w:p>
@@ -917,9 +970,16 @@
             <w:tcW w:type="dxa" w:w="4677"/>
           </w:tcPr>
           <w:p>
-            <w:pPr/>
-            <w:r>
-              <w:t>HitPipe; пять участников</w:t>
+            <w:pPr>
+              <w:spacing w:line="240" w:lineRule="auto" w:after="60"/>
+              <w:ind w:firstLine="0"/>
+              <w:jc w:val="left"/>
+            </w:pPr>
+            <w:r>
+              <w:rPr>
+                <w:sz w:val="24"/>
+              </w:rPr>
+              <w:t>HitPipe; Processing — Operations Core</w:t>
             </w:r>
           </w:p>
         </w:tc>
@@ -933,8 +993,15 @@
             <w:tcW w:type="dxa" w:w="4677"/>
           </w:tcPr>
           <w:p>
-            <w:pPr/>
-            <w:r>
+            <w:pPr>
+              <w:spacing w:line="240" w:lineRule="auto" w:after="60"/>
+              <w:ind w:firstLine="0"/>
+              <w:jc w:val="left"/>
+            </w:pPr>
+            <w:r>
+              <w:rPr>
+                <w:sz w:val="24"/>
+              </w:rPr>
               <w:t>Личный участок</w:t>
             </w:r>
           </w:p>
@@ -944,8 +1011,15 @@
             <w:tcW w:type="dxa" w:w="4677"/>
           </w:tcPr>
           <w:p>
-            <w:pPr/>
-            <w:r>
+            <w:pPr>
+              <w:spacing w:line="240" w:lineRule="auto" w:after="60"/>
+              <w:ind w:firstLine="0"/>
+              <w:jc w:val="left"/>
+            </w:pPr>
+            <w:r>
+              <w:rPr>
+                <w:sz w:val="24"/>
+              </w:rPr>
               <w:t>Processing / PaidOrderEligibility; services/processing</w:t>
             </w:r>
           </w:p>
@@ -960,8 +1034,15 @@
             <w:tcW w:type="dxa" w:w="4677"/>
           </w:tcPr>
           <w:p>
-            <w:pPr/>
-            <w:r>
+            <w:pPr>
+              <w:spacing w:line="240" w:lineRule="auto" w:after="60"/>
+              <w:ind w:firstLine="0"/>
+              <w:jc w:val="left"/>
+            </w:pPr>
+            <w:r>
+              <w:rPr>
+                <w:sz w:val="24"/>
+              </w:rPr>
               <w:t>Репозиторий</w:t>
             </w:r>
           </w:p>
@@ -971,17 +1052,30 @@
             <w:tcW w:type="dxa" w:w="4677"/>
           </w:tcPr>
           <w:p>
-            <w:pPr/>
-            <w:r/>
+            <w:pPr>
+              <w:spacing w:line="240" w:lineRule="auto" w:after="60"/>
+              <w:ind w:firstLine="0"/>
+              <w:jc w:val="left"/>
+            </w:pPr>
+            <w:r>
+              <w:rPr>
+                <w:sz w:val="24"/>
+              </w:rPr>
+            </w:r>
             <w:hyperlink r:id="rId16">
               <w:r>
                 <w:rPr>
                   <w:rStyle w:val="Hyperlink"/>
+                  <w:sz w:val="24"/>
                 </w:rPr>
                 <w:t>https://github.com/hitpipe/hitpipe</w:t>
               </w:r>
             </w:hyperlink>
-            <w:r/>
+            <w:r>
+              <w:rPr>
+                <w:sz w:val="24"/>
+              </w:rPr>
+            </w:r>
           </w:p>
         </w:tc>
       </w:tr>
@@ -994,8 +1088,15 @@
             <w:tcW w:type="dxa" w:w="4677"/>
           </w:tcPr>
           <w:p>
-            <w:pPr/>
-            <w:r>
+            <w:pPr>
+              <w:spacing w:line="240" w:lineRule="auto" w:after="60"/>
+              <w:ind w:firstLine="0"/>
+              <w:jc w:val="left"/>
+            </w:pPr>
+            <w:r>
+              <w:rPr>
+                <w:sz w:val="24"/>
+              </w:rPr>
               <w:t>Тег сдачи</w:t>
             </w:r>
           </w:p>
@@ -1005,8 +1106,15 @@
             <w:tcW w:type="dxa" w:w="4677"/>
           </w:tcPr>
           <w:p>
-            <w:pPr/>
-            <w:r>
+            <w:pPr>
+              <w:spacing w:line="240" w:lineRule="auto" w:after="60"/>
+              <w:ind w:firstLine="0"/>
+              <w:jc w:val="left"/>
+            </w:pPr>
+            <w:r>
+              <w:rPr>
+                <w:sz w:val="24"/>
+              </w:rPr>
               <w:t>0104-pz01-tp-v1 — НЕ СОЗДАН, human gate</w:t>
             </w:r>
           </w:p>
@@ -1021,8 +1129,15 @@
             <w:tcW w:type="dxa" w:w="4677"/>
           </w:tcPr>
           <w:p>
-            <w:pPr/>
-            <w:r>
+            <w:pPr>
+              <w:spacing w:line="240" w:lineRule="auto" w:after="60"/>
+              <w:ind w:firstLine="0"/>
+              <w:jc w:val="left"/>
+            </w:pPr>
+            <w:r>
+              <w:rPr>
+                <w:sz w:val="24"/>
+              </w:rPr>
               <w:t>Вариант</w:t>
             </w:r>
           </w:p>
@@ -1032,8 +1147,15 @@
             <w:tcW w:type="dxa" w:w="4677"/>
           </w:tcPr>
           <w:p>
-            <w:pPr/>
-            <w:r>
+            <w:pPr>
+              <w:spacing w:line="240" w:lineRule="auto" w:after="60"/>
+              <w:ind w:firstLine="0"/>
+              <w:jc w:val="left"/>
+            </w:pPr>
+            <w:r>
+              <w:rPr>
+                <w:sz w:val="24"/>
+              </w:rPr>
               <w:t>Собственный существенный module и offline consumer, не резервный стенд</w:t>
             </w:r>
           </w:p>
@@ -1048,8 +1170,15 @@
             <w:tcW w:type="dxa" w:w="4677"/>
           </w:tcPr>
           <w:p>
-            <w:pPr/>
-            <w:r>
+            <w:pPr>
+              <w:spacing w:line="240" w:lineRule="auto" w:after="60"/>
+              <w:ind w:firstLine="0"/>
+              <w:jc w:val="left"/>
+            </w:pPr>
+            <w:r>
+              <w:rPr>
+                <w:sz w:val="24"/>
+              </w:rPr>
               <w:t>Версия</w:t>
             </w:r>
           </w:p>
@@ -1059,9 +1188,16 @@
             <w:tcW w:type="dxa" w:w="4677"/>
           </w:tcPr>
           <w:p>
-            <w:pPr/>
-            <w:r>
-              <w:t>Code 4a2bfcdd9bf7; CI 8ae5d67b9eb0. Полные SHA: evidence/c3/record.json и evidence/ci/runs.json</w:t>
+            <w:pPr>
+              <w:spacing w:line="240" w:lineRule="auto" w:after="60"/>
+              <w:ind w:firstLine="0"/>
+              <w:jc w:val="left"/>
+            </w:pPr>
+            <w:r>
+              <w:rPr>
+                <w:sz w:val="24"/>
+              </w:rPr>
+              <w:t>Принятый main ec0dcba7ca42; Go 1.27.2. Полные SHA и CI: submission-record.json; evidence/report-refresh-20261019/accepted-pr-state.json</w:t>
             </w:r>
           </w:p>
         </w:tc>
@@ -1075,8 +1211,15 @@
             <w:tcW w:type="dxa" w:w="4677"/>
           </w:tcPr>
           <w:p>
-            <w:pPr/>
-            <w:r>
+            <w:pPr>
+              <w:spacing w:line="240" w:lineRule="auto" w:after="60"/>
+              <w:ind w:firstLine="0"/>
+              <w:jc w:val="left"/>
+            </w:pPr>
+            <w:r>
+              <w:rPr>
+                <w:sz w:val="24"/>
+              </w:rPr>
               <w:t>Состояние</w:t>
             </w:r>
           </w:p>
@@ -1086,9 +1229,16 @@
             <w:tcW w:type="dxa" w:w="4677"/>
           </w:tcPr>
           <w:p>
-            <w:pPr/>
-            <w:r>
-              <w:t>CONTENT_READY_IMAGES_PENDING; human gates pending</w:t>
+            <w:pPr>
+              <w:spacing w:line="240" w:lineRule="auto" w:after="60"/>
+              <w:ind w:firstLine="0"/>
+              <w:jc w:val="left"/>
+            </w:pPr>
+            <w:r>
+              <w:rPr>
+                <w:sz w:val="24"/>
+              </w:rPr>
+              <w:t>CONTENT_READY_IMAGES_PENDING; сдача не принята</w:t>
             </w:r>
           </w:p>
         </w:tc>
@@ -1102,8 +1252,15 @@
             <w:tcW w:type="dxa" w:w="4677"/>
           </w:tcPr>
           <w:p>
-            <w:pPr/>
-            <w:r>
+            <w:pPr>
+              <w:spacing w:line="240" w:lineRule="auto" w:after="60"/>
+              <w:ind w:firstLine="0"/>
+              <w:jc w:val="left"/>
+            </w:pPr>
+            <w:r>
+              <w:rPr>
+                <w:sz w:val="24"/>
+              </w:rPr>
               <w:t>Источник формы</w:t>
             </w:r>
           </w:p>
@@ -1113,8 +1270,15 @@
             <w:tcW w:type="dxa" w:w="4677"/>
           </w:tcPr>
           <w:p>
-            <w:pPr/>
-            <w:r>
+            <w:pPr>
+              <w:spacing w:line="240" w:lineRule="auto" w:after="60"/>
+              <w:ind w:firstLine="0"/>
+              <w:jc w:val="left"/>
+            </w:pPr>
+            <w:r>
+              <w:rPr>
+                <w:sz w:val="24"/>
+              </w:rPr>
               <w:t>Четыре адаптированные формы bootstrap v2</w:t>
             </w:r>
           </w:p>
@@ -1163,7 +1327,16 @@
             <w:tcW w:type="dxa" w:w="2339"/>
           </w:tcPr>
           <w:p>
-            <w:r>
+            <w:pPr>
+              <w:spacing w:line="240" w:lineRule="auto" w:after="60"/>
+              <w:ind w:firstLine="0"/>
+              <w:jc w:val="left"/>
+            </w:pPr>
+            <w:r>
+              <w:rPr>
+                <w:b/>
+                <w:sz w:val="24"/>
+              </w:rPr>
               <w:t>Позиция</w:t>
             </w:r>
           </w:p>
@@ -1173,7 +1346,16 @@
             <w:tcW w:type="dxa" w:w="2339"/>
           </w:tcPr>
           <w:p>
-            <w:r>
+            <w:pPr>
+              <w:spacing w:line="240" w:lineRule="auto" w:after="60"/>
+              <w:ind w:firstLine="0"/>
+              <w:jc w:val="left"/>
+            </w:pPr>
+            <w:r>
+              <w:rPr>
+                <w:b/>
+                <w:sz w:val="24"/>
+              </w:rPr>
               <w:t>Средство и закреплённая версия</w:t>
             </w:r>
           </w:p>
@@ -1183,7 +1365,16 @@
             <w:tcW w:type="dxa" w:w="2339"/>
           </w:tcPr>
           <w:p>
-            <w:r>
+            <w:pPr>
+              <w:spacing w:line="240" w:lineRule="auto" w:after="60"/>
+              <w:ind w:firstLine="0"/>
+              <w:jc w:val="left"/>
+            </w:pPr>
+            <w:r>
+              <w:rPr>
+                <w:b/>
+                <w:sz w:val="24"/>
+              </w:rPr>
               <w:t>Назначение и способ подключения</w:t>
             </w:r>
           </w:p>
@@ -1193,7 +1384,16 @@
             <w:tcW w:type="dxa" w:w="2339"/>
           </w:tcPr>
           <w:p>
-            <w:r>
+            <w:pPr>
+              <w:spacing w:line="240" w:lineRule="auto" w:after="60"/>
+              <w:ind w:firstLine="0"/>
+              <w:jc w:val="left"/>
+            </w:pPr>
+            <w:r>
+              <w:rPr>
+                <w:b/>
+                <w:sz w:val="24"/>
+              </w:rPr>
               <w:t>Работает / запланировано, этап</w:t>
             </w:r>
           </w:p>
@@ -1208,8 +1408,15 @@
             <w:tcW w:type="dxa" w:w="2339"/>
           </w:tcPr>
           <w:p>
-            <w:pPr/>
-            <w:r>
+            <w:pPr>
+              <w:spacing w:line="240" w:lineRule="auto" w:after="60"/>
+              <w:ind w:firstLine="0"/>
+              <w:jc w:val="left"/>
+            </w:pPr>
+            <w:r>
+              <w:rPr>
+                <w:sz w:val="24"/>
+              </w:rPr>
               <w:t>Сборка</w:t>
             </w:r>
           </w:p>
@@ -1219,8 +1426,15 @@
             <w:tcW w:type="dxa" w:w="2339"/>
           </w:tcPr>
           <w:p>
-            <w:pPr/>
-            <w:r>
+            <w:pPr>
+              <w:spacing w:line="240" w:lineRule="auto" w:after="60"/>
+              <w:ind w:firstLine="0"/>
+              <w:jc w:val="left"/>
+            </w:pPr>
+            <w:r>
+              <w:rPr>
+                <w:sz w:val="24"/>
+              </w:rPr>
               <w:t>Go1.27.2</w:t>
             </w:r>
           </w:p>
@@ -1230,8 +1444,15 @@
             <w:tcW w:type="dxa" w:w="2339"/>
           </w:tcPr>
           <w:p>
-            <w:pPr/>
-            <w:r>
+            <w:pPr>
+              <w:spacing w:line="240" w:lineRule="auto" w:after="60"/>
+              <w:ind w:firstLine="0"/>
+              <w:jc w:val="left"/>
+            </w:pPr>
+            <w:r>
+              <w:rPr>
+                <w:sz w:val="24"/>
+              </w:rPr>
               <w:t>wrapper build processing --mode dev/release</w:t>
             </w:r>
           </w:p>
@@ -1241,9 +1462,16 @@
             <w:tcW w:type="dxa" w:w="2339"/>
           </w:tcPr>
           <w:p>
-            <w:pPr/>
-            <w:r>
-              <w:t>РАБОТАЕТ; evidence/d1</w:t>
+            <w:pPr>
+              <w:spacing w:line="240" w:lineRule="auto" w:after="60"/>
+              <w:ind w:firstLine="0"/>
+              <w:jc w:val="left"/>
+            </w:pPr>
+            <w:r>
+              <w:rPr>
+                <w:sz w:val="24"/>
+              </w:rPr>
+              <w:t>РАБОТАЕТ; accepted-main-extra</w:t>
             </w:r>
           </w:p>
         </w:tc>
@@ -1257,8 +1485,15 @@
             <w:tcW w:type="dxa" w:w="2339"/>
           </w:tcPr>
           <w:p>
-            <w:pPr/>
-            <w:r>
+            <w:pPr>
+              <w:spacing w:line="240" w:lineRule="auto" w:after="60"/>
+              <w:ind w:firstLine="0"/>
+              <w:jc w:val="left"/>
+            </w:pPr>
+            <w:r>
+              <w:rPr>
+                <w:sz w:val="24"/>
+              </w:rPr>
               <w:t>Зависимости</w:t>
             </w:r>
           </w:p>
@@ -1268,8 +1503,15 @@
             <w:tcW w:type="dxa" w:w="2339"/>
           </w:tcPr>
           <w:p>
-            <w:pPr/>
-            <w:r>
+            <w:pPr>
+              <w:spacing w:line="240" w:lineRule="auto" w:after="60"/>
+              <w:ind w:firstLine="0"/>
+              <w:jc w:val="left"/>
+            </w:pPr>
+            <w:r>
+              <w:rPr>
+                <w:sz w:val="24"/>
+              </w:rPr>
               <w:t>go.mod / stdlib</w:t>
             </w:r>
           </w:p>
@@ -1279,8 +1521,15 @@
             <w:tcW w:type="dxa" w:w="2339"/>
           </w:tcPr>
           <w:p>
-            <w:pPr/>
-            <w:r>
+            <w:pPr>
+              <w:spacing w:line="240" w:lineRule="auto" w:after="60"/>
+              <w:ind w:firstLine="0"/>
+              <w:jc w:val="left"/>
+            </w:pPr>
+            <w:r>
+              <w:rPr>
+                <w:sz w:val="24"/>
+              </w:rPr>
               <w:t>go version -m; сторонних modules0</w:t>
             </w:r>
           </w:p>
@@ -1290,8 +1539,15 @@
             <w:tcW w:type="dxa" w:w="2339"/>
           </w:tcPr>
           <w:p>
-            <w:pPr/>
-            <w:r>
+            <w:pPr>
+              <w:spacing w:line="240" w:lineRule="auto" w:after="60"/>
+              <w:ind w:firstLine="0"/>
+              <w:jc w:val="left"/>
+            </w:pPr>
+            <w:r>
+              <w:rPr>
+                <w:sz w:val="24"/>
+              </w:rPr>
               <w:t>РАБОТАЕТ</w:t>
             </w:r>
           </w:p>
@@ -1306,8 +1562,15 @@
             <w:tcW w:type="dxa" w:w="2339"/>
           </w:tcPr>
           <w:p>
-            <w:pPr/>
-            <w:r>
+            <w:pPr>
+              <w:spacing w:line="240" w:lineRule="auto" w:after="60"/>
+              <w:ind w:firstLine="0"/>
+              <w:jc w:val="left"/>
+            </w:pPr>
+            <w:r>
+              <w:rPr>
+                <w:sz w:val="24"/>
+              </w:rPr>
               <w:t>Тесты</w:t>
             </w:r>
           </w:p>
@@ -1317,8 +1580,15 @@
             <w:tcW w:type="dxa" w:w="2339"/>
           </w:tcPr>
           <w:p>
-            <w:pPr/>
-            <w:r>
+            <w:pPr>
+              <w:spacing w:line="240" w:lineRule="auto" w:after="60"/>
+              <w:ind w:firstLine="0"/>
+              <w:jc w:val="left"/>
+            </w:pPr>
+            <w:r>
+              <w:rPr>
+                <w:sz w:val="24"/>
+              </w:rPr>
               <w:t>Go testing1.27.2</w:t>
             </w:r>
           </w:p>
@@ -1328,8 +1598,15 @@
             <w:tcW w:type="dxa" w:w="2339"/>
           </w:tcPr>
           <w:p>
-            <w:pPr/>
-            <w:r>
+            <w:pPr>
+              <w:spacing w:line="240" w:lineRule="auto" w:after="60"/>
+              <w:ind w:firstLine="0"/>
+              <w:jc w:val="left"/>
+            </w:pPr>
+            <w:r>
+              <w:rPr>
+                <w:sz w:val="24"/>
+              </w:rPr>
               <w:t>workspace.py check; именованные assertions</w:t>
             </w:r>
           </w:p>
@@ -1339,9 +1616,16 @@
             <w:tcW w:type="dxa" w:w="2339"/>
           </w:tcPr>
           <w:p>
-            <w:pPr/>
-            <w:r>
-              <w:t>РАБОТАЕТ; c3/check</w:t>
+            <w:pPr>
+              <w:spacing w:line="240" w:lineRule="auto" w:after="60"/>
+              <w:ind w:firstLine="0"/>
+              <w:jc w:val="left"/>
+            </w:pPr>
+            <w:r>
+              <w:rPr>
+                <w:sz w:val="24"/>
+              </w:rPr>
+              <w:t>РАБОТАЕТ; accepted-main/check</w:t>
             </w:r>
           </w:p>
         </w:tc>
@@ -1355,8 +1639,15 @@
             <w:tcW w:type="dxa" w:w="2339"/>
           </w:tcPr>
           <w:p>
-            <w:pPr/>
-            <w:r>
+            <w:pPr>
+              <w:spacing w:line="240" w:lineRule="auto" w:after="60"/>
+              <w:ind w:firstLine="0"/>
+              <w:jc w:val="left"/>
+            </w:pPr>
+            <w:r>
+              <w:rPr>
+                <w:sz w:val="24"/>
+              </w:rPr>
               <w:t>Статический анализ</w:t>
             </w:r>
           </w:p>
@@ -1366,8 +1657,15 @@
             <w:tcW w:type="dxa" w:w="2339"/>
           </w:tcPr>
           <w:p>
-            <w:pPr/>
-            <w:r>
+            <w:pPr>
+              <w:spacing w:line="240" w:lineRule="auto" w:after="60"/>
+              <w:ind w:firstLine="0"/>
+              <w:jc w:val="left"/>
+            </w:pPr>
+            <w:r>
+              <w:rPr>
+                <w:sz w:val="24"/>
+              </w:rPr>
               <w:t>go vet + import guard</w:t>
             </w:r>
           </w:p>
@@ -1377,8 +1675,15 @@
             <w:tcW w:type="dxa" w:w="2339"/>
           </w:tcPr>
           <w:p>
-            <w:pPr/>
-            <w:r>
+            <w:pPr>
+              <w:spacing w:line="240" w:lineRule="auto" w:after="60"/>
+              <w:ind w:firstLine="0"/>
+              <w:jc w:val="left"/>
+            </w:pPr>
+            <w:r>
+              <w:rPr>
+                <w:sz w:val="24"/>
+              </w:rPr>
               <w:t>в составе check, service-local</w:t>
             </w:r>
           </w:p>
@@ -1388,8 +1693,15 @@
             <w:tcW w:type="dxa" w:w="2339"/>
           </w:tcPr>
           <w:p>
-            <w:pPr/>
-            <w:r>
+            <w:pPr>
+              <w:spacing w:line="240" w:lineRule="auto" w:after="60"/>
+              <w:ind w:firstLine="0"/>
+              <w:jc w:val="left"/>
+            </w:pPr>
+            <w:r>
+              <w:rPr>
+                <w:sz w:val="24"/>
+              </w:rPr>
               <w:t>РАБОТАЕТ</w:t>
             </w:r>
           </w:p>
@@ -1404,8 +1716,15 @@
             <w:tcW w:type="dxa" w:w="2339"/>
           </w:tcPr>
           <w:p>
-            <w:pPr/>
-            <w:r>
+            <w:pPr>
+              <w:spacing w:line="240" w:lineRule="auto" w:after="60"/>
+              <w:ind w:firstLine="0"/>
+              <w:jc w:val="left"/>
+            </w:pPr>
+            <w:r>
+              <w:rPr>
+                <w:sz w:val="24"/>
+              </w:rPr>
               <w:t>Динамическая диагностика</w:t>
             </w:r>
           </w:p>
@@ -1415,8 +1734,15 @@
             <w:tcW w:type="dxa" w:w="2339"/>
           </w:tcPr>
           <w:p>
-            <w:pPr/>
-            <w:r>
+            <w:pPr>
+              <w:spacing w:line="240" w:lineRule="auto" w:after="60"/>
+              <w:ind w:firstLine="0"/>
+              <w:jc w:val="left"/>
+            </w:pPr>
+            <w:r>
+              <w:rPr>
+                <w:sz w:val="24"/>
+              </w:rPr>
               <w:t>go test -race; safe CLI</w:t>
             </w:r>
           </w:p>
@@ -1426,8 +1752,15 @@
             <w:tcW w:type="dxa" w:w="2339"/>
           </w:tcPr>
           <w:p>
-            <w:pPr/>
-            <w:r>
+            <w:pPr>
+              <w:spacing w:line="240" w:lineRule="auto" w:after="60"/>
+              <w:ind w:firstLine="0"/>
+              <w:jc w:val="left"/>
+            </w:pPr>
+            <w:r>
+              <w:rPr>
+                <w:sz w:val="24"/>
+              </w:rPr>
               <w:t>race и start/result/version; Delve позднее</w:t>
             </w:r>
           </w:p>
@@ -1437,8 +1770,15 @@
             <w:tcW w:type="dxa" w:w="2339"/>
           </w:tcPr>
           <w:p>
-            <w:pPr/>
-            <w:r>
+            <w:pPr>
+              <w:spacing w:line="240" w:lineRule="auto" w:after="60"/>
+              <w:ind w:firstLine="0"/>
+              <w:jc w:val="left"/>
+            </w:pPr>
+            <w:r>
+              <w:rPr>
+                <w:sz w:val="24"/>
+              </w:rPr>
               <w:t>Race РАБОТАЕТ; Delve PLANNED</w:t>
             </w:r>
           </w:p>
@@ -1453,8 +1793,15 @@
             <w:tcW w:type="dxa" w:w="2339"/>
           </w:tcPr>
           <w:p>
-            <w:pPr/>
-            <w:r>
+            <w:pPr>
+              <w:spacing w:line="240" w:lineRule="auto" w:after="60"/>
+              <w:ind w:firstLine="0"/>
+              <w:jc w:val="left"/>
+            </w:pPr>
+            <w:r>
+              <w:rPr>
+                <w:sz w:val="24"/>
+              </w:rPr>
               <w:t>Профилирование</w:t>
             </w:r>
           </w:p>
@@ -1464,8 +1811,15 @@
             <w:tcW w:type="dxa" w:w="2339"/>
           </w:tcPr>
           <w:p>
-            <w:pPr/>
-            <w:r>
+            <w:pPr>
+              <w:spacing w:line="240" w:lineRule="auto" w:after="60"/>
+              <w:ind w:firstLine="0"/>
+              <w:jc w:val="left"/>
+            </w:pPr>
+            <w:r>
+              <w:rPr>
+                <w:sz w:val="24"/>
+              </w:rPr>
               <w:t>Go pprof1.27.2</w:t>
             </w:r>
           </w:p>
@@ -1475,8 +1829,15 @@
             <w:tcW w:type="dxa" w:w="2339"/>
           </w:tcPr>
           <w:p>
-            <w:pPr/>
-            <w:r>
+            <w:pPr>
+              <w:spacing w:line="240" w:lineRule="auto" w:after="60"/>
+              <w:ind w:firstLine="0"/>
+              <w:jc w:val="left"/>
+            </w:pPr>
+            <w:r>
+              <w:rPr>
+                <w:sz w:val="24"/>
+              </w:rPr>
               <w:t>будущий benchmark/cpuprofile evaluator</w:t>
             </w:r>
           </w:p>
@@ -1486,8 +1847,15 @@
             <w:tcW w:type="dxa" w:w="2339"/>
           </w:tcPr>
           <w:p>
-            <w:pPr/>
-            <w:r>
+            <w:pPr>
+              <w:spacing w:line="240" w:lineRule="auto" w:after="60"/>
+              <w:ind w:firstLine="0"/>
+              <w:jc w:val="left"/>
+            </w:pPr>
+            <w:r>
+              <w:rPr>
+                <w:sz w:val="24"/>
+              </w:rPr>
               <w:t>PLANNED следующая работа</w:t>
             </w:r>
           </w:p>
@@ -1502,8 +1870,15 @@
             <w:tcW w:type="dxa" w:w="2339"/>
           </w:tcPr>
           <w:p>
-            <w:pPr/>
-            <w:r>
+            <w:pPr>
+              <w:spacing w:line="240" w:lineRule="auto" w:after="60"/>
+              <w:ind w:firstLine="0"/>
+              <w:jc w:val="left"/>
+            </w:pPr>
+            <w:r>
+              <w:rPr>
+                <w:sz w:val="24"/>
+              </w:rPr>
               <w:t>CI</w:t>
             </w:r>
           </w:p>
@@ -1513,8 +1888,15 @@
             <w:tcW w:type="dxa" w:w="2339"/>
           </w:tcPr>
           <w:p>
-            <w:pPr/>
-            <w:r>
+            <w:pPr>
+              <w:spacing w:line="240" w:lineRule="auto" w:after="60"/>
+              <w:ind w:firstLine="0"/>
+              <w:jc w:val="left"/>
+            </w:pPr>
+            <w:r>
+              <w:rPr>
+                <w:sz w:val="24"/>
+              </w:rPr>
               <w:t>Actions Ubuntu24.04, Go1.27.2</w:t>
             </w:r>
           </w:p>
@@ -1524,8 +1906,15 @@
             <w:tcW w:type="dxa" w:w="2339"/>
           </w:tcPr>
           <w:p>
-            <w:pPr/>
-            <w:r>
+            <w:pPr>
+              <w:spacing w:line="240" w:lineRule="auto" w:after="60"/>
+              <w:ind w:firstLine="0"/>
+              <w:jc w:val="left"/>
+            </w:pPr>
+            <w:r>
+              <w:rPr>
+                <w:sz w:val="24"/>
+              </w:rPr>
               <w:t>pr12-tp.yml pull_request/work push</w:t>
             </w:r>
           </w:p>
@@ -1535,8 +1924,15 @@
             <w:tcW w:type="dxa" w:w="2339"/>
           </w:tcPr>
           <w:p>
-            <w:pPr/>
-            <w:r>
+            <w:pPr>
+              <w:spacing w:line="240" w:lineRule="auto" w:after="60"/>
+              <w:ind w:firstLine="0"/>
+              <w:jc w:val="left"/>
+            </w:pPr>
+            <w:r>
+              <w:rPr>
+                <w:sz w:val="24"/>
+              </w:rPr>
               <w:t>РАБОТАЕТ, actual CI link в тексте</w:t>
             </w:r>
           </w:p>
@@ -1560,19 +1956,10 @@
       </w:r>
     </w:p>
     <w:p>
-      <w:r/>
+      <w:r>
+        <w:t xml:space="preserve">HIT-27 → work/HIT-27-paid-order-eligibility → </w:t>
+      </w:r>
       <w:hyperlink r:id="rId11">
-        <w:r>
-          <w:rPr>
-            <w:rStyle w:val="Hyperlink"/>
-          </w:rPr>
-          <w:t>https://hitpipe.atlassian.net/browse/HIT-27</w:t>
-        </w:r>
-      </w:hyperlink>
-      <w:r>
-        <w:t xml:space="preserve"> → work/HIT-27-paid-order-eligibility → </w:t>
-      </w:r>
-      <w:hyperlink r:id="rId12">
         <w:r>
           <w:rPr>
             <w:rStyle w:val="Hyperlink"/>
@@ -1581,7 +1968,7 @@
         </w:r>
       </w:hyperlink>
       <w:r>
-        <w:t>. Реальные check/smoke/inspection evidence/c1. Независимый human review/merge HUMAN_PENDING, main напрямую не менялся. Рисунок1 после реального открытия кода.</w:t>
+        <w:t>. PR №5 и авторский fix №20 фактически merged; принятый main ec0dcba7ca42ea59909489cef9650c6edff12f35. Bootstrap №2 также merged. Отчётный PR №10 открыт с базой main. Рисунок 1 относится к принятому коду.</w:t>
       </w:r>
     </w:p>
     <w:p>
@@ -1594,7 +1981,7 @@
     </w:p>
     <w:p>
       <w:r>
-        <w:t>Go sources + go.mod → stdlib/dependency resolution → compiler → linker с version/fullSHA/dirty/buildMode → Mach-O → OS loader + system libraries → flags/fixture → application consumer → domain → typed result/exit. go version -m и otool -L реально выполнены (evidence/c1). Подключены libSystem.B.dylib и libresolv.9.dylib; полностью статический binary не заявляется. Подробнее execution-path.md.</w:t>
+        <w:t>Go sources + go.mod → compiler → linker (version/commit/dirty/mode) → Mach-O → OS loader/dylibs → CLI/fixture → application → domain → result. go version -m и otool -L подтвердили libSystem и libresolv на принятом main. Это Darwin/arm64; полностью статический binary не заявляется. Новые inspect-release.log и libraries.log находятся в accepted-main-extra/.</w:t>
       </w:r>
     </w:p>
     <w:p>
@@ -1625,7 +2012,16 @@
             <w:tcW w:type="dxa" w:w="3118"/>
           </w:tcPr>
           <w:p>
-            <w:r>
+            <w:pPr>
+              <w:spacing w:line="240" w:lineRule="auto" w:after="60"/>
+              <w:ind w:firstLine="0"/>
+              <w:jc w:val="left"/>
+            </w:pPr>
+            <w:r>
+              <w:rPr>
+                <w:b/>
+                <w:sz w:val="24"/>
+              </w:rPr>
               <w:t>Вопрос</w:t>
             </w:r>
           </w:p>
@@ -1635,7 +2031,16 @@
             <w:tcW w:type="dxa" w:w="3118"/>
           </w:tcPr>
           <w:p>
-            <w:r>
+            <w:pPr>
+              <w:spacing w:line="240" w:lineRule="auto" w:after="60"/>
+              <w:ind w:firstLine="0"/>
+              <w:jc w:val="left"/>
+            </w:pPr>
+            <w:r>
+              <w:rPr>
+                <w:b/>
+                <w:sz w:val="24"/>
+              </w:rPr>
               <w:t>Режим разработки: команда и наблюдение</w:t>
             </w:r>
           </w:p>
@@ -1645,7 +2050,16 @@
             <w:tcW w:type="dxa" w:w="3118"/>
           </w:tcPr>
           <w:p>
-            <w:r>
+            <w:pPr>
+              <w:spacing w:line="240" w:lineRule="auto" w:after="60"/>
+              <w:ind w:firstLine="0"/>
+              <w:jc w:val="left"/>
+            </w:pPr>
+            <w:r>
+              <w:rPr>
+                <w:b/>
+                <w:sz w:val="24"/>
+              </w:rPr>
               <w:t>Режим поставки: команда и наблюдение</w:t>
             </w:r>
           </w:p>
@@ -1660,8 +2074,15 @@
             <w:tcW w:type="dxa" w:w="3118"/>
           </w:tcPr>
           <w:p>
-            <w:pPr/>
-            <w:r>
+            <w:pPr>
+              <w:spacing w:line="240" w:lineRule="auto" w:after="60"/>
+              <w:ind w:firstLine="0"/>
+              <w:jc w:val="left"/>
+            </w:pPr>
+            <w:r>
+              <w:rPr>
+                <w:sz w:val="24"/>
+              </w:rPr>
               <w:t>Подготовка</w:t>
             </w:r>
           </w:p>
@@ -1671,8 +2092,15 @@
             <w:tcW w:type="dxa" w:w="3118"/>
           </w:tcPr>
           <w:p>
-            <w:pPr/>
-            <w:r>
+            <w:pPr>
+              <w:spacing w:line="240" w:lineRule="auto" w:after="60"/>
+              <w:ind w:firstLine="0"/>
+              <w:jc w:val="left"/>
+            </w:pPr>
+            <w:r>
+              <w:rPr>
+                <w:sz w:val="24"/>
+              </w:rPr>
               <w:t>wrapper build --mode dev</w:t>
             </w:r>
           </w:p>
@@ -1682,8 +2110,15 @@
             <w:tcW w:type="dxa" w:w="3118"/>
           </w:tcPr>
           <w:p>
-            <w:pPr/>
-            <w:r>
+            <w:pPr>
+              <w:spacing w:line="240" w:lineRule="auto" w:after="60"/>
+              <w:ind w:firstLine="0"/>
+              <w:jc w:val="left"/>
+            </w:pPr>
+            <w:r>
+              <w:rPr>
+                <w:sz w:val="24"/>
+              </w:rPr>
               <w:t>wrapper build --mode release</w:t>
             </w:r>
           </w:p>
@@ -1698,8 +2133,15 @@
             <w:tcW w:type="dxa" w:w="3118"/>
           </w:tcPr>
           <w:p>
-            <w:pPr/>
-            <w:r>
+            <w:pPr>
+              <w:spacing w:line="240" w:lineRule="auto" w:after="60"/>
+              <w:ind w:firstLine="0"/>
+              <w:jc w:val="left"/>
+            </w:pPr>
+            <w:r>
+              <w:rPr>
+                <w:sz w:val="24"/>
+              </w:rPr>
               <w:t>Преобразования</w:t>
             </w:r>
           </w:p>
@@ -1709,8 +2151,15 @@
             <w:tcW w:type="dxa" w:w="3118"/>
           </w:tcPr>
           <w:p>
-            <w:pPr/>
-            <w:r>
+            <w:pPr>
+              <w:spacing w:line="240" w:lineRule="auto" w:after="60"/>
+              <w:ind w:firstLine="0"/>
+              <w:jc w:val="left"/>
+            </w:pPr>
+            <w:r>
+              <w:rPr>
+                <w:sz w:val="24"/>
+              </w:rPr>
               <w:t>compiler/linker, metadata SHA/dirty</w:t>
             </w:r>
           </w:p>
@@ -1720,8 +2169,15 @@
             <w:tcW w:type="dxa" w:w="3118"/>
           </w:tcPr>
           <w:p>
-            <w:pPr/>
-            <w:r>
+            <w:pPr>
+              <w:spacing w:line="240" w:lineRule="auto" w:after="60"/>
+              <w:ind w:firstLine="0"/>
+              <w:jc w:val="left"/>
+            </w:pPr>
+            <w:r>
+              <w:rPr>
+                <w:sz w:val="24"/>
+              </w:rPr>
               <w:t>compiler/linker, metadata SHA/dirty</w:t>
             </w:r>
           </w:p>
@@ -1736,8 +2192,15 @@
             <w:tcW w:type="dxa" w:w="3118"/>
           </w:tcPr>
           <w:p>
-            <w:pPr/>
-            <w:r>
+            <w:pPr>
+              <w:spacing w:line="240" w:lineRule="auto" w:after="60"/>
+              <w:ind w:firstLine="0"/>
+              <w:jc w:val="left"/>
+            </w:pPr>
+            <w:r>
+              <w:rPr>
+                <w:sz w:val="24"/>
+              </w:rPr>
               <w:t>Оптимизации</w:t>
             </w:r>
           </w:p>
@@ -1747,8 +2210,15 @@
             <w:tcW w:type="dxa" w:w="3118"/>
           </w:tcPr>
           <w:p>
-            <w:pPr/>
-            <w:r>
+            <w:pPr>
+              <w:spacing w:line="240" w:lineRule="auto" w:after="60"/>
+              <w:ind w:firstLine="0"/>
+              <w:jc w:val="left"/>
+            </w:pPr>
+            <w:r>
+              <w:rPr>
+                <w:sz w:val="24"/>
+              </w:rPr>
               <w:t>-gcflags=all=-N -l</w:t>
             </w:r>
           </w:p>
@@ -1758,8 +2228,15 @@
             <w:tcW w:type="dxa" w:w="3118"/>
           </w:tcPr>
           <w:p>
-            <w:pPr/>
-            <w:r>
+            <w:pPr>
+              <w:spacing w:line="240" w:lineRule="auto" w:after="60"/>
+              <w:ind w:firstLine="0"/>
+              <w:jc w:val="left"/>
+            </w:pPr>
+            <w:r>
+              <w:rPr>
+                <w:sz w:val="24"/>
+              </w:rPr>
               <w:t>-trimpath; обычные Go optimizations</w:t>
             </w:r>
           </w:p>
@@ -1774,8 +2251,15 @@
             <w:tcW w:type="dxa" w:w="3118"/>
           </w:tcPr>
           <w:p>
-            <w:pPr/>
-            <w:r>
+            <w:pPr>
+              <w:spacing w:line="240" w:lineRule="auto" w:after="60"/>
+              <w:ind w:firstLine="0"/>
+              <w:jc w:val="left"/>
+            </w:pPr>
+            <w:r>
+              <w:rPr>
+                <w:sz w:val="24"/>
+              </w:rPr>
               <w:t>Отладка</w:t>
             </w:r>
           </w:p>
@@ -1785,8 +2269,15 @@
             <w:tcW w:type="dxa" w:w="3118"/>
           </w:tcPr>
           <w:p>
-            <w:pPr/>
-            <w:r>
+            <w:pPr>
+              <w:spacing w:line="240" w:lineRule="auto" w:after="60"/>
+              <w:ind w:firstLine="0"/>
+              <w:jc w:val="left"/>
+            </w:pPr>
+            <w:r>
+              <w:rPr>
+                <w:sz w:val="24"/>
+              </w:rPr>
               <w:t>debug info compiler; safe diagnostics</w:t>
             </w:r>
           </w:p>
@@ -1796,8 +2287,15 @@
             <w:tcW w:type="dxa" w:w="3118"/>
           </w:tcPr>
           <w:p>
-            <w:pPr/>
-            <w:r>
+            <w:pPr>
+              <w:spacing w:line="240" w:lineRule="auto" w:after="60"/>
+              <w:ind w:firstLine="0"/>
+              <w:jc w:val="left"/>
+            </w:pPr>
+            <w:r>
+              <w:rPr>
+                <w:sz w:val="24"/>
+              </w:rPr>
               <w:t>debug info не удалена; trimmed paths</w:t>
             </w:r>
           </w:p>
@@ -1812,8 +2310,15 @@
             <w:tcW w:type="dxa" w:w="3118"/>
           </w:tcPr>
           <w:p>
-            <w:pPr/>
-            <w:r>
+            <w:pPr>
+              <w:spacing w:line="240" w:lineRule="auto" w:after="60"/>
+              <w:ind w:firstLine="0"/>
+              <w:jc w:val="left"/>
+            </w:pPr>
+            <w:r>
+              <w:rPr>
+                <w:sz w:val="24"/>
+              </w:rPr>
               <w:t>Проверки</w:t>
             </w:r>
           </w:p>
@@ -1823,9 +2328,16 @@
             <w:tcW w:type="dxa" w:w="3118"/>
           </w:tcPr>
           <w:p>
-            <w:pPr/>
-            <w:r>
-              <w:t>valid0, refund0, invalid2</w:t>
+            <w:pPr>
+              <w:spacing w:line="240" w:lineRule="auto" w:after="60"/>
+              <w:ind w:firstLine="0"/>
+              <w:jc w:val="left"/>
+            </w:pPr>
+            <w:r>
+              <w:rPr>
+                <w:sz w:val="24"/>
+              </w:rPr>
+              <w:t>valid/refund: exit 0; invalid/aliases: exit 2</w:t>
             </w:r>
           </w:p>
         </w:tc>
@@ -1834,9 +2346,16 @@
             <w:tcW w:type="dxa" w:w="3118"/>
           </w:tcPr>
           <w:p>
-            <w:pPr/>
-            <w:r>
-              <w:t>valid0, refund0, invalid2</w:t>
+            <w:pPr>
+              <w:spacing w:line="240" w:lineRule="auto" w:after="60"/>
+              <w:ind w:firstLine="0"/>
+              <w:jc w:val="left"/>
+            </w:pPr>
+            <w:r>
+              <w:rPr>
+                <w:sz w:val="24"/>
+              </w:rPr>
+              <w:t>Те же исходы на тех же fixtures</w:t>
             </w:r>
           </w:p>
         </w:tc>
@@ -1850,8 +2369,15 @@
             <w:tcW w:type="dxa" w:w="3118"/>
           </w:tcPr>
           <w:p>
-            <w:pPr/>
-            <w:r>
+            <w:pPr>
+              <w:spacing w:line="240" w:lineRule="auto" w:after="60"/>
+              <w:ind w:firstLine="0"/>
+              <w:jc w:val="left"/>
+            </w:pPr>
+            <w:r>
+              <w:rPr>
+                <w:sz w:val="24"/>
+              </w:rPr>
               <w:t>Поставка</w:t>
             </w:r>
           </w:p>
@@ -1861,9 +2387,16 @@
             <w:tcW w:type="dxa" w:w="3118"/>
           </w:tcPr>
           <w:p>
-            <w:pPr/>
-            <w:r>
-              <w:t>3948210 bytes; binary+fixture</w:t>
+            <w:pPr>
+              <w:spacing w:line="240" w:lineRule="auto" w:after="60"/>
+              <w:ind w:firstLine="0"/>
+              <w:jc w:val="left"/>
+            </w:pPr>
+            <w:r>
+              <w:rPr>
+                <w:sz w:val="24"/>
+              </w:rPr>
+              <w:t>3948434 bytes; binary + fixtures</w:t>
             </w:r>
           </w:p>
         </w:tc>
@@ -1872,9 +2405,16 @@
             <w:tcW w:type="dxa" w:w="3118"/>
           </w:tcPr>
           <w:p>
-            <w:pPr/>
-            <w:r>
-              <w:t>3909730 bytes; binary+fixture; system dylibs</w:t>
+            <w:pPr>
+              <w:spacing w:line="240" w:lineRule="auto" w:after="60"/>
+              <w:ind w:firstLine="0"/>
+              <w:jc w:val="left"/>
+            </w:pPr>
+            <w:r>
+              <w:rPr>
+                <w:sz w:val="24"/>
+              </w:rPr>
+              <w:t>3909890 bytes; binary + fixtures; system dylibs</w:t>
             </w:r>
           </w:p>
         </w:tc>
@@ -1882,7 +2422,7 @@
     </w:tbl>
     <w:p>
       <w:r>
-        <w:t>Один fixed scenario valid.json, затем refunded.json и invalid.json. При SHA 8ae5d67b9eb0f4ffc729a270c2ee14e1c052b0cb оба режима запущены вне checkout: version, normal, changed fixture и invalid input. Dev binary3948210 bytes; release3909730 bytes. Все восемь expected exits совпали; timing/performance не измерялись. Cwd/argv/binary/log digests в evidence/d1/delivery-observations.json. Рисунки2–3.</w:t>
+        <w:t>19.10.2026 на main ec0dcba7ca42 (Darwin/arm64) dev/release запущены вне checkout. Размеры 3948434/3909890 bytes. Version/valid/refund/invalid/оба порядка aliases/bad-format дали ожидаемые exits: normal/REFUND — 0, невалидный JSON/format — 2. Timing не измерялся. Полные cwd/argv/env/SHA/digests: delivery-observations.json нового evidence.</w:t>
       </w:r>
     </w:p>
     <w:p>
@@ -1922,7 +2462,16 @@
             <w:tcW w:type="dxa" w:w="2339"/>
           </w:tcPr>
           <w:p>
-            <w:r>
+            <w:pPr>
+              <w:spacing w:line="240" w:lineRule="auto" w:after="60"/>
+              <w:ind w:firstLine="0"/>
+              <w:jc w:val="left"/>
+            </w:pPr>
+            <w:r>
+              <w:rPr>
+                <w:b/>
+                <w:sz w:val="24"/>
+              </w:rPr>
               <w:t>Проверка</w:t>
             </w:r>
           </w:p>
@@ -1932,7 +2481,16 @@
             <w:tcW w:type="dxa" w:w="2339"/>
           </w:tcPr>
           <w:p>
-            <w:r>
+            <w:pPr>
+              <w:spacing w:line="240" w:lineRule="auto" w:after="60"/>
+              <w:ind w:firstLine="0"/>
+              <w:jc w:val="left"/>
+            </w:pPr>
+            <w:r>
+              <w:rPr>
+                <w:b/>
+                <w:sz w:val="24"/>
+              </w:rPr>
               <w:t>Ожидаемый результат</w:t>
             </w:r>
           </w:p>
@@ -1942,7 +2500,16 @@
             <w:tcW w:type="dxa" w:w="2339"/>
           </w:tcPr>
           <w:p>
-            <w:r>
+            <w:pPr>
+              <w:spacing w:line="240" w:lineRule="auto" w:after="60"/>
+              <w:ind w:firstLine="0"/>
+              <w:jc w:val="left"/>
+            </w:pPr>
+            <w:r>
+              <w:rPr>
+                <w:b/>
+                <w:sz w:val="24"/>
+              </w:rPr>
               <w:t>Фактический результат/статус</w:t>
             </w:r>
           </w:p>
@@ -1952,7 +2519,16 @@
             <w:tcW w:type="dxa" w:w="2339"/>
           </w:tcPr>
           <w:p>
-            <w:r>
+            <w:pPr>
+              <w:spacing w:line="240" w:lineRule="auto" w:after="60"/>
+              <w:ind w:firstLine="0"/>
+              <w:jc w:val="left"/>
+            </w:pPr>
+            <w:r>
+              <w:rPr>
+                <w:b/>
+                <w:sz w:val="24"/>
+              </w:rPr>
               <w:t>Команда, версия и журнал</w:t>
             </w:r>
           </w:p>
@@ -1967,9 +2543,16 @@
             <w:tcW w:type="dxa" w:w="2339"/>
           </w:tcPr>
           <w:p>
-            <w:pPr/>
-            <w:r>
-              <w:t>Настройка fixture</w:t>
+            <w:pPr>
+              <w:spacing w:line="240" w:lineRule="auto" w:after="60"/>
+              <w:ind w:firstLine="0"/>
+              <w:jc w:val="left"/>
+            </w:pPr>
+            <w:r>
+              <w:rPr>
+                <w:sz w:val="24"/>
+              </w:rPr>
+              <w:t>Fixture refund=1</w:t>
             </w:r>
           </w:p>
         </w:tc>
@@ -1978,9 +2561,16 @@
             <w:tcW w:type="dxa" w:w="2339"/>
           </w:tcPr>
           <w:p>
-            <w:pPr/>
-            <w:r>
-              <w:t>VALID → INELIGIBLE/REFUND</w:t>
+            <w:pPr>
+              <w:spacing w:line="240" w:lineRule="auto" w:after="60"/>
+              <w:ind w:firstLine="0"/>
+              <w:jc w:val="left"/>
+            </w:pPr>
+            <w:r>
+              <w:rPr>
+                <w:sz w:val="24"/>
+              </w:rPr>
+              <w:t>INELIGIBLE / REFUND, exit 0</w:t>
             </w:r>
           </w:p>
         </w:tc>
@@ -1989,8 +2579,15 @@
             <w:tcW w:type="dxa" w:w="2339"/>
           </w:tcPr>
           <w:p>
-            <w:pPr/>
-            <w:r>
+            <w:pPr>
+              <w:spacing w:line="240" w:lineRule="auto" w:after="60"/>
+              <w:ind w:firstLine="0"/>
+              <w:jc w:val="left"/>
+            </w:pPr>
+            <w:r>
+              <w:rPr>
+                <w:sz w:val="24"/>
+              </w:rPr>
               <w:t>PASS в обоих режимах</w:t>
             </w:r>
           </w:p>
@@ -2000,9 +2597,16 @@
             <w:tcW w:type="dxa" w:w="2339"/>
           </w:tcPr>
           <w:p>
-            <w:pPr/>
-            <w:r>
-              <w:t>evidence/d1/*normal / *changed-config</w:t>
+            <w:pPr>
+              <w:spacing w:line="240" w:lineRule="auto" w:after="60"/>
+              <w:ind w:firstLine="0"/>
+              <w:jc w:val="left"/>
+            </w:pPr>
+            <w:r>
+              <w:rPr>
+                <w:sz w:val="24"/>
+              </w:rPr>
+              <w:t>accepted-delivery-outside/*-refund.log</w:t>
             </w:r>
           </w:p>
         </w:tc>
@@ -2016,9 +2620,16 @@
             <w:tcW w:type="dxa" w:w="2339"/>
           </w:tcPr>
           <w:p>
-            <w:pPr/>
-            <w:r>
-              <w:t>Invalid config</w:t>
+            <w:pPr>
+              <w:spacing w:line="240" w:lineRule="auto" w:after="60"/>
+              <w:ind w:firstLine="0"/>
+              <w:jc w:val="left"/>
+            </w:pPr>
+            <w:r>
+              <w:rPr>
+                <w:sz w:val="24"/>
+              </w:rPr>
+              <w:t>Aliases в обоих порядках</w:t>
             </w:r>
           </w:p>
         </w:tc>
@@ -2027,9 +2638,16 @@
             <w:tcW w:type="dxa" w:w="2339"/>
           </w:tcPr>
           <w:p>
-            <w:pPr/>
-            <w:r>
-              <w:t>INVALID_JSON, exit2</w:t>
+            <w:pPr>
+              <w:spacing w:line="240" w:lineRule="auto" w:after="60"/>
+              <w:ind w:firstLine="0"/>
+              <w:jc w:val="left"/>
+            </w:pPr>
+            <w:r>
+              <w:rPr>
+                <w:sz w:val="24"/>
+              </w:rPr>
+              <w:t>INVALID_JSON, exit 2, stdout пуст</w:t>
             </w:r>
           </w:p>
         </w:tc>
@@ -2038,9 +2656,16 @@
             <w:tcW w:type="dxa" w:w="2339"/>
           </w:tcPr>
           <w:p>
-            <w:pPr/>
-            <w:r>
-              <w:t>PASS: actual exit2</w:t>
+            <w:pPr>
+              <w:spacing w:line="240" w:lineRule="auto" w:after="60"/>
+              <w:ind w:firstLine="0"/>
+              <w:jc w:val="left"/>
+            </w:pPr>
+            <w:r>
+              <w:rPr>
+                <w:sz w:val="24"/>
+              </w:rPr>
+              <w:t>PASS в обоих режимах</w:t>
             </w:r>
           </w:p>
         </w:tc>
@@ -2049,9 +2674,16 @@
             <w:tcW w:type="dxa" w:w="2339"/>
           </w:tcPr>
           <w:p>
-            <w:pPr/>
-            <w:r>
-              <w:t>d1/*invalid-config.log</w:t>
+            <w:pPr>
+              <w:spacing w:line="240" w:lineRule="auto" w:after="60"/>
+              <w:ind w:firstLine="0"/>
+              <w:jc w:val="left"/>
+            </w:pPr>
+            <w:r>
+              <w:rPr>
+                <w:sz w:val="24"/>
+              </w:rPr>
+              <w:t>*-shadow.log; *-reverse.log</w:t>
             </w:r>
           </w:p>
         </w:tc>
@@ -2065,9 +2697,16 @@
             <w:tcW w:type="dxa" w:w="2339"/>
           </w:tcPr>
           <w:p>
-            <w:pPr/>
-            <w:r>
-              <w:t>Версия</w:t>
+            <w:pPr>
+              <w:spacing w:line="240" w:lineRule="auto" w:after="60"/>
+              <w:ind w:firstLine="0"/>
+              <w:jc w:val="left"/>
+            </w:pPr>
+            <w:r>
+              <w:rPr>
+                <w:sz w:val="24"/>
+              </w:rPr>
+              <w:t>Неверный format</w:t>
             </w:r>
           </w:p>
         </w:tc>
@@ -2076,9 +2715,16 @@
             <w:tcW w:type="dxa" w:w="2339"/>
           </w:tcPr>
           <w:p>
-            <w:pPr/>
-            <w:r>
-              <w:t>full SHA + dirty + mode</w:t>
+            <w:pPr>
+              <w:spacing w:line="240" w:lineRule="auto" w:after="60"/>
+              <w:ind w:firstLine="0"/>
+              <w:jc w:val="left"/>
+            </w:pPr>
+            <w:r>
+              <w:rPr>
+                <w:sz w:val="24"/>
+              </w:rPr>
+              <w:t>INVALID_CONFIGURATION, exit 2</w:t>
             </w:r>
           </w:p>
         </w:tc>
@@ -2087,9 +2733,16 @@
             <w:tcW w:type="dxa" w:w="2339"/>
           </w:tcPr>
           <w:p>
-            <w:pPr/>
-            <w:r>
-              <w:t>PASS, dirty=false</w:t>
+            <w:pPr>
+              <w:spacing w:line="240" w:lineRule="auto" w:after="60"/>
+              <w:ind w:firstLine="0"/>
+              <w:jc w:val="left"/>
+            </w:pPr>
+            <w:r>
+              <w:rPr>
+                <w:sz w:val="24"/>
+              </w:rPr>
+              <w:t>PASS</w:t>
             </w:r>
           </w:p>
         </w:tc>
@@ -2098,9 +2751,16 @@
             <w:tcW w:type="dxa" w:w="2339"/>
           </w:tcPr>
           <w:p>
-            <w:pPr/>
-            <w:r>
-              <w:t>d1/*version.log</w:t>
+            <w:pPr>
+              <w:spacing w:line="240" w:lineRule="auto" w:after="60"/>
+              <w:ind w:firstLine="0"/>
+              <w:jc w:val="left"/>
+            </w:pPr>
+            <w:r>
+              <w:rPr>
+                <w:sz w:val="24"/>
+              </w:rPr>
+              <w:t>*-bad-format.log</w:t>
             </w:r>
           </w:p>
         </w:tc>
@@ -2114,9 +2774,16 @@
             <w:tcW w:type="dxa" w:w="2339"/>
           </w:tcPr>
           <w:p>
-            <w:pPr/>
-            <w:r>
-              <w:t>Диагностика</w:t>
+            <w:pPr>
+              <w:spacing w:line="240" w:lineRule="auto" w:after="60"/>
+              <w:ind w:firstLine="0"/>
+              <w:jc w:val="left"/>
+            </w:pPr>
+            <w:r>
+              <w:rPr>
+                <w:sz w:val="24"/>
+              </w:rPr>
+              <w:t>Версия</w:t>
             </w:r>
           </w:p>
         </w:tc>
@@ -2125,9 +2792,16 @@
             <w:tcW w:type="dxa" w:w="2339"/>
           </w:tcPr>
           <w:p>
-            <w:pPr/>
-            <w:r>
-              <w:t>start/result без raw data</w:t>
+            <w:pPr>
+              <w:spacing w:line="240" w:lineRule="auto" w:after="60"/>
+              <w:ind w:firstLine="0"/>
+              <w:jc w:val="left"/>
+            </w:pPr>
+            <w:r>
+              <w:rPr>
+                <w:sz w:val="24"/>
+              </w:rPr>
+              <w:t>Принятый SHA; dirty=false; mode</w:t>
             </w:r>
           </w:p>
         </w:tc>
@@ -2136,9 +2810,16 @@
             <w:tcW w:type="dxa" w:w="2339"/>
           </w:tcPr>
           <w:p>
-            <w:pPr/>
-            <w:r>
-              <w:t>PASS, CLI tests и actual logs</w:t>
+            <w:pPr>
+              <w:spacing w:line="240" w:lineRule="auto" w:after="60"/>
+              <w:ind w:firstLine="0"/>
+              <w:jc w:val="left"/>
+            </w:pPr>
+            <w:r>
+              <w:rPr>
+                <w:sz w:val="24"/>
+              </w:rPr>
+              <w:t>PASS</w:t>
             </w:r>
           </w:p>
         </w:tc>
@@ -2147,9 +2828,16 @@
             <w:tcW w:type="dxa" w:w="2339"/>
           </w:tcPr>
           <w:p>
-            <w:pPr/>
-            <w:r>
-              <w:t>c3/check.log; d1 logs</w:t>
+            <w:pPr>
+              <w:spacing w:line="240" w:lineRule="auto" w:after="60"/>
+              <w:ind w:firstLine="0"/>
+              <w:jc w:val="left"/>
+            </w:pPr>
+            <w:r>
+              <w:rPr>
+                <w:sz w:val="24"/>
+              </w:rPr>
+              <w:t>*-version.log</w:t>
             </w:r>
           </w:p>
         </w:tc>
@@ -2163,9 +2851,16 @@
             <w:tcW w:type="dxa" w:w="2339"/>
           </w:tcPr>
           <w:p>
-            <w:pPr/>
-            <w:r>
-              <w:t>Повтор/reset</w:t>
+            <w:pPr>
+              <w:spacing w:line="240" w:lineRule="auto" w:after="60"/>
+              <w:ind w:firstLine="0"/>
+              <w:jc w:val="left"/>
+            </w:pPr>
+            <w:r>
+              <w:rPr>
+                <w:sz w:val="24"/>
+              </w:rPr>
+              <w:t>Known zero / false</w:t>
             </w:r>
           </w:p>
         </w:tc>
@@ -2174,9 +2869,16 @@
             <w:tcW w:type="dxa" w:w="2339"/>
           </w:tcPr>
           <w:p>
-            <w:pPr/>
-            <w:r>
-              <w:t>fresh immutable fixtures</w:t>
+            <w:pPr>
+              <w:spacing w:line="240" w:lineRule="auto" w:after="60"/>
+              <w:ind w:firstLine="0"/>
+              <w:jc w:val="left"/>
+            </w:pPr>
+            <w:r>
+              <w:rPr>
+                <w:sz w:val="24"/>
+              </w:rPr>
+              <w:t>VALID на canonical fixture</w:t>
             </w:r>
           </w:p>
         </w:tc>
@@ -2185,9 +2887,16 @@
             <w:tcW w:type="dxa" w:w="2339"/>
           </w:tcPr>
           <w:p>
-            <w:pPr/>
-            <w:r>
-              <w:t>PASS same result; нет durable state</w:t>
+            <w:pPr>
+              <w:spacing w:line="240" w:lineRule="auto" w:after="60"/>
+              <w:ind w:firstLine="0"/>
+              <w:jc w:val="left"/>
+            </w:pPr>
+            <w:r>
+              <w:rPr>
+                <w:sz w:val="24"/>
+              </w:rPr>
+              <w:t>PASS; unit regression сохраняет ненулевые pointers</w:t>
             </w:r>
           </w:p>
         </w:tc>
@@ -2196,9 +2905,16 @@
             <w:tcW w:type="dxa" w:w="2339"/>
           </w:tcPr>
           <w:p>
-            <w:pPr/>
-            <w:r>
-              <w:t>c3/check; ReaderSubstitution</w:t>
+            <w:pPr>
+              <w:spacing w:line="240" w:lineRule="auto" w:after="60"/>
+              <w:ind w:firstLine="0"/>
+              <w:jc w:val="left"/>
+            </w:pPr>
+            <w:r>
+              <w:rPr>
+                <w:sz w:val="24"/>
+              </w:rPr>
+              <w:t>*-valid.log; check.log</w:t>
             </w:r>
           </w:p>
         </w:tc>
@@ -2232,385 +2948,722 @@
     </w:p>
     <w:p>
       <w:r>
-        <w:t xml:space="preserve">CI </w:t>
+        <w:t xml:space="preserve">CI принятого main </w:t>
+      </w:r>
+      <w:hyperlink r:id="rId12">
+        <w:r>
+          <w:rPr>
+            <w:rStyle w:val="Hyperlink"/>
+          </w:rPr>
+          <w:t>https://github.com/hitpipe/hitpipe/actions/runs/39229206910</w:t>
+        </w:r>
+      </w:hyperlink>
+      <w:r>
+        <w:t xml:space="preserve"> — success: Go 1.27.2 Linux, tests/vet/smoke/race/mutations. Собственные local runs — Darwin/arm64. M01 на том же main: build 0, wrapper 1 из-за assertion, restoration 0/clean=true. Новые журналы: evidence/report-refresh-20261019/accepted-mutations/. Это не личная проверка другого студента. Рисунок 7.</w:t>
+      </w:r>
+    </w:p>
+    <w:p>
+      <w:pPr>
+        <w:pStyle w:val="af7"/>
+      </w:pPr>
+      <w:r>
+        <w:t>5 Заключение и индивидуальный вклад</w:t>
+      </w:r>
+    </w:p>
+    <w:p>
+      <w:r>
+        <w:t>Каркас, конфигурация, версия и диагностика работают; инженерные PR №3–9/20/22 приняты в main. TP-REV-001 VERIFIED_FIXED: case aliases отклоняются до decode. Canonical refund=0/false допустимы, refund=1 — обычный INELIGIBLE/REFUND, неоднозначный JSON — exit 2 без eligibility output. Независимое студенческое воспроизведение, снимки, принятие отчётов, теги и защита ожидаются. VALID означает только финансовую допустимость; live provider/полный MVP не реализованы этим модулем.</w:t>
+      </w:r>
+    </w:p>
+    <w:p>
+      <w:pPr>
+        <w:pStyle w:val="af7"/>
+      </w:pPr>
+      <w:r>
+        <w:t>СПИСОК ИСПОЛЬЗОВАННЫХ МАТЕРИАЛОВ</w:t>
+      </w:r>
+    </w:p>
+    <w:p>
+      <w:r>
+        <w:t>Источники: ../context-lock.json, ../source-files.json, ../upstream/product/HP-DOC-SHARED-001.md (RULE006/011/012, revision2), HP-CAP-002 (revision2), HP-DOC-PVL-001 (HP-VER-001, revision2); ../upstream/architecture/HP-BP-002.md T004, HP-BP-003.md T002/006/012, HP-BP-007.md T005/010; реальные revisions ../upstream/architecture/published-revisions.json. Общие charter/MVP/regulation/stack-decision созданы Lead/его агентом и переиспользованы; личные требования, код, tests и отчёты подготовлены для Тимофея с Codex. Методичка 01.04 ПР1: SHA256 634558eccc37617289d2beee8e4a56e12f4f3cedf989cd2046a8649cae102b9c; точный файл inputs/index.json.</w:t>
+      </w:r>
+    </w:p>
+    <w:p>
+      <w:pPr>
+        <w:pStyle w:val="af7"/>
+      </w:pPr>
+      <w:r>
+        <w:t>ПРИЛОЖЕНИЕ. ИНСТРУКЦИИ ДЛЯ ОБЯЗАТЕЛЬНЫХ РИСУНКОВ</w:t>
+      </w:r>
+    </w:p>
+    <w:p>
+      <w:r>
+        <w:t>Ниже точные инструкции человеку. Изображения не создавались и не снимались агентом. Источники, actual status и версии сохранены; ещё не состоявшиеся gates выполняются до снимка. Placeholder не подтверждает PASS.</w:t>
+      </w:r>
+    </w:p>
+    <w:p>
+      <w:pPr>
+        <w:pStyle w:val="afa"/>
+      </w:pPr>
+      <w:r>
+        <w:t>Рисунок 1 — Собственная часть исполняемого каркаса</w:t>
+      </w:r>
+    </w:p>
+    <w:p>
+      <w:pPr>
+        <w:spacing w:line="240" w:lineRule="auto" w:after="120"/>
+        <w:ind w:firstLine="0"/>
+        <w:jc w:val="left"/>
+      </w:pPr>
+      <w:r>
+        <w:rPr>
+          <w:sz w:val="20"/>
+        </w:rPr>
+        <w:t>[ВСТАВИТЬ РЕАЛЬНОЕ ИЗОБРАЖЕНИЕ ВРУЧНУЮ: 0104-pz01-01.png]</w:t>
+      </w:r>
+    </w:p>
+    <w:p>
+      <w:pPr>
+        <w:spacing w:line="240" w:lineRule="auto" w:after="120"/>
+        <w:ind w:firstLine="0"/>
+        <w:jc w:val="left"/>
+      </w:pPr>
+      <w:r>
+        <w:rPr>
+          <w:sz w:val="20"/>
+        </w:rPr>
+        <w:t xml:space="preserve">SOURCE: </w:t>
       </w:r>
       <w:hyperlink r:id="rId13">
         <w:r>
           <w:rPr>
             <w:rStyle w:val="Hyperlink"/>
+            <w:sz w:val="20"/>
           </w:rPr>
-          <w:t>https://github.com/hitpipe/hitpipe/actions/runs/39121031226</w:t>
+          <w:t>https://github.com/hitpipe/hitpipe/blob/ec0dcba7ca42ea59909489cef9650c6edff12f35/services/processing/cmd/processing-contractcheck/main.go</w:t>
         </w:r>
       </w:hyperlink>
       <w:r>
-        <w:t xml:space="preserve"> на 8ae5d67b9eb0f4ffc729a270c2ee14e1c052b0cb: named tests/vet, smoke обоих режимов, race, compiled mutation experiments. Чувствительность проверена локально тем же workspace.py check processing --require на M01: exit ненулевой из-за refund assertion; evidence/mutations/negative-gate.log. После восстановления baseline/restored PASS, clean=true. Offline scope; human review, provider truth и full MVP не проверяются. Рисунок7.</w:t>
+        <w:rPr>
+          <w:sz w:val="20"/>
+        </w:rPr>
+        <w:br/>
+        <w:t>STATE: PASS_RECORDED_SCOPE; main ec0dcba7ca42ea59909489cef9650c6edff12f35; CAPTURE_PENDING</w:t>
+        <w:br/>
+        <w:t>CWD: /Users/tima/Documents/Codex/2026-10-18/files-pasted-by-the-user-hitpipe/work/hit32-accepted-main</w:t>
+        <w:br/>
+        <w:t>COMMAND: git show ec0dcba7ca42ea59909489cef9650c6edff12f35:services/processing/cmd/processing-contractcheck/main.go</w:t>
+        <w:br/>
+        <w:t>STEPS: 1. Открыть указанный источник и сверить SHA ec0dcba7ca42. 1. Открыть exact GitHub file либо редактор clean checkout. 2. Найти var version/commit/dirty/buildMode, flag fixture/format и run. 3. Показать собственный parser/diagnostic/composition фрагмент и Task HIT-27/PR5. После настоящей проверки человек делает PNG; агент изображение для отчёта не создавал.</w:t>
       </w:r>
     </w:p>
     <w:p>
       <w:pPr>
-        <w:pStyle w:val="af7"/>
-      </w:pPr>
-      <w:r>
-        <w:t>5 Заключение и индивидуальный вклад</w:t>
+        <w:spacing w:line="240" w:lineRule="auto" w:after="120"/>
+        <w:ind w:firstLine="0"/>
+        <w:jc w:val="left"/>
+      </w:pPr>
+      <w:r>
+        <w:rPr>
+          <w:sz w:val="20"/>
+        </w:rPr>
+        <w:t>MUST BE VISIBLE: File path, SHA, metadata, config selection, safe output/error handling</w:t>
+        <w:br/>
+        <w:t>REDACT: Скрыть tokens/passwords/cookies, личную почту и соседние окна. Не скрывать task/SHA/command/assertion/exit. Не показывать реальные payment/customer payloads; использовать только синтетические fixtures.</w:t>
+        <w:br/>
+        <w:t xml:space="preserve">VERIFY: Сверить actual SHA ec0dcba7ca42ea59909489cef9650c6edff12f35 и CI </w:t>
+      </w:r>
+      <w:hyperlink r:id="rId12">
+        <w:r>
+          <w:rPr>
+            <w:rStyle w:val="Hyperlink"/>
+            <w:sz w:val="20"/>
+          </w:rPr>
+          <w:t>https://github.com/hitpipe/hitpipe/actions/runs/39229206910</w:t>
+        </w:r>
+      </w:hyperlink>
+      <w:r>
+        <w:rPr>
+          <w:sz w:val="20"/>
+        </w:rPr>
+        <w:t>. Placeholder не PASS. Для human gate сначала выполнить настоящую проверку с участниками/датой/своим SHA. После принятия отчётов и реальных снимков заново проверить пагинацию/оглавление; финальный tag→commit→CI записывает уполномоченный человек.</w:t>
       </w:r>
     </w:p>
     <w:p>
-      <w:r>
-        <w:t>Реализован переиспользуемый Processing diagnostic и финансовый evaluator, сопоставлены реальные режимы и dependencies. Введённые настройки дают наблюдаемое изменение и error exit. Независимое воспроизведение, review/merge, снимки и защита ещё human gates; tag0104-pz01-tp-v1 не создан. VALID означает только финансовую допустимость. Case admission/lifecycle, actor/epoch, lineage, fresh dispatch, authenticated source provenance/digest, реальные Stripe/ClickUp и full MVP не реализованы этим модулем и не объявлены PASS.</w:t>
+      <w:pPr>
+        <w:spacing w:line="240" w:lineRule="auto" w:after="120"/>
+        <w:ind w:firstLine="0"/>
+        <w:jc w:val="left"/>
+      </w:pPr>
+      <w:r>
+        <w:rPr>
+          <w:sz w:val="20"/>
+        </w:rPr>
+        <w:t>TARGET: docs/labs/pr12/tp/evidence/screenshots/0104-pz01-01.png</w:t>
+        <w:br/>
+        <w:t>CAPTION: Рисунок 1 — Собственная часть исполняемого каркаса</w:t>
+        <w:br/>
+        <w:t>INSERT AT: docs/labs/pr12/tp/reports/0104-pz01-tp.docx: блок «Рисунок 1», заменить единственный абзац плейсхолдера для 0104-pz01-01.png. Подпись указана в CAPTION; инструкции SOURCE/STATE/COMMAND сохранить до вставки.</w:t>
       </w:r>
     </w:p>
     <w:p>
       <w:pPr>
-        <w:pStyle w:val="af7"/>
-      </w:pPr>
-      <w:r>
-        <w:t>СПИСОК ИСПОЛЬЗОВАННЫХ МАТЕРИАЛОВ</w:t>
+        <w:pStyle w:val="afa"/>
+      </w:pPr>
+      <w:r>
+        <w:t>Рисунок 2 — Подготовка компонента в двух режимах</w:t>
       </w:r>
     </w:p>
     <w:p>
-      <w:r>
-        <w:t>Источники: ../context-lock.json, ../source-files.json, ../upstream/product/HP-DOC-SHARED-001.md (RULE006/011/012, revision2), HP-CAP-002 (revision2), HP-DOC-PVL-001 (HP-VER-001, revision2); ../upstream/architecture/HP-BP-002.md T004, HP-BP-003.md T002/006/012, HP-BP-007.md T005/010; реальные revisions ../upstream/architecture/published-revisions.json. Общие charter/MVP/regulation/stack-decision созданы Lead/его агентом и переиспользованы; личные требования, код, tests и отчёты подготовлены для Тимофея с Codex. Методичка 01.04 ПР1: SHA256 634558eccc37617289d2beee8e4a56e12f4f3cedf989cd2046a8649cae102b9c; точный файл inputs/index.json.</w:t>
+      <w:pPr>
+        <w:spacing w:line="240" w:lineRule="auto" w:after="120"/>
+        <w:ind w:firstLine="0"/>
+        <w:jc w:val="left"/>
+      </w:pPr>
+      <w:r>
+        <w:rPr>
+          <w:sz w:val="20"/>
+        </w:rPr>
+        <w:t>[ВСТАВИТЬ РЕАЛЬНОЕ ИЗОБРАЖЕНИЕ ВРУЧНУЮ: 0104-pz01-02.png]</w:t>
       </w:r>
     </w:p>
     <w:p>
       <w:pPr>
-        <w:pStyle w:val="af7"/>
-      </w:pPr>
-      <w:r>
-        <w:t>ПРИЛОЖЕНИЕ. ИНСТРУКЦИИ ДЛЯ ОБЯЗАТЕЛЬНЫХ РИСУНКОВ</w:t>
+        <w:spacing w:line="240" w:lineRule="auto" w:after="120"/>
+        <w:ind w:firstLine="0"/>
+        <w:jc w:val="left"/>
+      </w:pPr>
+      <w:r>
+        <w:rPr>
+          <w:sz w:val="20"/>
+        </w:rPr>
+        <w:t>SOURCE: /Users/tima/Documents/Codex/2026-10-18/files-pasted-by-the-user-hitpipe/work/hitpipe/docs/labs/pr12/tp/evidence/report-refresh-20261019/accepted-main-extra/inspect-dev.log; /Users/tima/Documents/Codex/2026-10-18/files-pasted-by-the-user-hitpipe/work/hitpipe/docs/labs/pr12/tp/evidence/report-refresh-20261019/accepted-main-extra/inspect-release.log</w:t>
+        <w:br/>
+        <w:t>STATE: PASS_RECORDED_SCOPE; main ec0dcba7ca42ea59909489cef9650c6edff12f35; CAPTURE_PENDING</w:t>
+        <w:br/>
+        <w:t>CWD: /Users/tima/Documents/Codex/2026-10-18/files-pasted-by-the-user-hitpipe/work/hit32-accepted-main</w:t>
+        <w:br/>
+        <w:t>COMMAND: export PATH=/Users/tima/Documents/Codex/2026-10-18/files-pasted-by-the-user-hitpipe/work/go/bin:$PATH; go version; git rev-parse HEAD; python3 tools/pr12/workspace.py build processing --mode dev --require; python3 tools/pr12/workspace.py build processing --mode release --require</w:t>
+        <w:br/>
+        <w:t>STEPS: 1. Открыть указанный источник и сверить SHA ec0dcba7ca42. 1. Открыть terminal exact source ec0dcba7 и показать fullSHA/Go1.27.2. 2. Выполнить обе команды. 3. Раскрыть actual flags -N -l и -trimpath, linker metadata. 4. Показать exit0 каждого; размеры из delivery-observations.json. После настоящей проверки человек делает PNG; агент изображение для отчёта не создавал.</w:t>
       </w:r>
     </w:p>
     <w:p>
-      <w:r>
-        <w:t>Ниже точные инструкции человеку. Изображения не создавались и не снимались агентом. Источники, actual status и версии сохранены; ещё не состоявшиеся gates выполняются до снимка. Placeholder не подтверждает PASS.</w:t>
+      <w:pPr>
+        <w:spacing w:line="240" w:lineRule="auto" w:after="120"/>
+        <w:ind w:firstLine="0"/>
+        <w:jc w:val="left"/>
+      </w:pPr>
+      <w:r>
+        <w:rPr>
+          <w:sz w:val="20"/>
+        </w:rPr>
+        <w:t>MUST BE VISIBLE: Both commands and flags, modes, same source SHA, exit0</w:t>
+        <w:br/>
+        <w:t>REDACT: Скрыть tokens/passwords/cookies, личную почту и соседние окна. Не скрывать task/SHA/command/assertion/exit. Не показывать реальные payment/customer payloads; использовать только синтетические fixtures.</w:t>
+        <w:br/>
+        <w:t xml:space="preserve">VERIFY: Сверить actual SHA ec0dcba7ca42ea59909489cef9650c6edff12f35 и CI </w:t>
+      </w:r>
+      <w:hyperlink r:id="rId12">
+        <w:r>
+          <w:rPr>
+            <w:rStyle w:val="Hyperlink"/>
+            <w:sz w:val="20"/>
+          </w:rPr>
+          <w:t>https://github.com/hitpipe/hitpipe/actions/runs/39229206910</w:t>
+        </w:r>
+      </w:hyperlink>
+      <w:r>
+        <w:rPr>
+          <w:sz w:val="20"/>
+        </w:rPr>
+        <w:t>. Placeholder не PASS. Для human gate сначала выполнить настоящую проверку с участниками/датой/своим SHA. После принятия отчётов и реальных снимков заново проверить пагинацию/оглавление; финальный tag→commit→CI записывает уполномоченный человек.</w:t>
       </w:r>
     </w:p>
     <w:p>
       <w:pPr>
-        <w:pStyle w:val="afa"/>
-      </w:pPr>
-      <w:r>
-        <w:t>Рисунок 1 — Собственная часть исполняемого каркаса</w:t>
+        <w:spacing w:line="240" w:lineRule="auto" w:after="120"/>
+        <w:ind w:firstLine="0"/>
+        <w:jc w:val="left"/>
+      </w:pPr>
+      <w:r>
+        <w:rPr>
+          <w:sz w:val="20"/>
+        </w:rPr>
+        <w:t>TARGET: docs/labs/pr12/tp/evidence/screenshots/0104-pz01-02.png</w:t>
+        <w:br/>
+        <w:t>CAPTION: Рисунок 2 — Подготовка компонента в двух режимах</w:t>
+        <w:br/>
+        <w:t>INSERT AT: docs/labs/pr12/tp/reports/0104-pz01-tp.docx: блок «Рисунок 2», заменить единственный абзац плейсхолдера для 0104-pz01-02.png. Подпись указана в CAPTION; инструкции SOURCE/STATE/COMMAND сохранить до вставки.</w:t>
       </w:r>
     </w:p>
     <w:p>
-      <w:r>
-        <w:t>[ВСТАВИТЬ РЕАЛЬНОЕ ИЗОБРАЖЕНИЕ ВРУЧНУЮ: 0104-pz01-01.png]</w:t>
+      <w:pPr>
+        <w:pStyle w:val="afa"/>
+      </w:pPr>
+      <w:r>
+        <w:t>Рисунок 3 — Запуск поставки вне исходного кода и IDE</w:t>
       </w:r>
     </w:p>
     <w:p>
-      <w:r>
-        <w:t xml:space="preserve">SOURCE: </w:t>
+      <w:pPr>
+        <w:spacing w:line="240" w:lineRule="auto" w:after="120"/>
+        <w:ind w:firstLine="0"/>
+        <w:jc w:val="left"/>
+      </w:pPr>
+      <w:r>
+        <w:rPr>
+          <w:sz w:val="20"/>
+        </w:rPr>
+        <w:t>[ВСТАВИТЬ РЕАЛЬНОЕ ИЗОБРАЖЕНИЕ ВРУЧНУЮ: 0104-pz01-03.png]</w:t>
+      </w:r>
+    </w:p>
+    <w:p>
+      <w:pPr>
+        <w:spacing w:line="240" w:lineRule="auto" w:after="120"/>
+        <w:ind w:firstLine="0"/>
+        <w:jc w:val="left"/>
+      </w:pPr>
+      <w:r>
+        <w:rPr>
+          <w:sz w:val="20"/>
+        </w:rPr>
+        <w:t>SOURCE: /Users/tima/Documents/Codex/2026-10-18/files-pasted-by-the-user-hitpipe/work/hitpipe/docs/labs/pr12/tp/evidence/report-refresh-20261019/accepted-delivery-outside</w:t>
+        <w:br/>
+        <w:t>STATE: PASS_RECORDED_SCOPE; main ec0dcba7ca42ea59909489cef9650c6edff12f35; CAPTURE_PENDING</w:t>
+        <w:br/>
+        <w:t>CWD: /Users/tima/Documents/Codex/2026-10-18/files-pasted-by-the-user-hitpipe/work/hit32-report-evidence/delivery-outside</w:t>
+        <w:br/>
+        <w:t>COMMAND: ./processing-release --version; ./processing-release --fixture valid.json --format json; echo $?</w:t>
+        <w:br/>
+        <w:t>STEPS: 1. Открыть новые delivery-observations.json и соответствующий журнал. 2. Для повторения использовать бинарник delivery-outside/processing-release, собранный из main, и полные synthetic fixtures рядом. 3. Выполнить команду из указанного cwd вне checkout; показать SHA/mode/result/exit. 4. Снять реальное окно терминала; не подменять его текстовым плейсхолдером.</w:t>
+      </w:r>
+    </w:p>
+    <w:p>
+      <w:pPr>
+        <w:spacing w:line="240" w:lineRule="auto" w:after="120"/>
+        <w:ind w:firstLine="0"/>
+        <w:jc w:val="left"/>
+      </w:pPr>
+      <w:r>
+        <w:rPr>
+          <w:sz w:val="20"/>
+        </w:rPr>
+        <w:t>MUST BE VISIBLE: Cwd вне source, binary/version/sourceSHA, declared files, VALID exit0</w:t>
+        <w:br/>
+        <w:t>REDACT: Скрыть tokens/passwords/cookies, личную почту и соседние окна. Не скрывать task/SHA/command/assertion/exit. Не показывать реальные payment/customer payloads; использовать только синтетические fixtures.</w:t>
+        <w:br/>
+        <w:t xml:space="preserve">VERIFY: Сверить actual SHA ec0dcba7ca42ea59909489cef9650c6edff12f35 и CI </w:t>
+      </w:r>
+      <w:hyperlink r:id="rId12">
+        <w:r>
+          <w:rPr>
+            <w:rStyle w:val="Hyperlink"/>
+            <w:sz w:val="20"/>
+          </w:rPr>
+          <w:t>https://github.com/hitpipe/hitpipe/actions/runs/39229206910</w:t>
+        </w:r>
+      </w:hyperlink>
+      <w:r>
+        <w:rPr>
+          <w:sz w:val="20"/>
+        </w:rPr>
+        <w:t>. Placeholder не PASS. Для human gate сначала выполнить настоящую проверку с участниками/датой/своим SHA. После принятия отчётов и реальных снимков заново проверить пагинацию/оглавление; финальный tag→commit→CI записывает уполномоченный человек.</w:t>
+      </w:r>
+    </w:p>
+    <w:p>
+      <w:pPr>
+        <w:spacing w:line="240" w:lineRule="auto" w:after="120"/>
+        <w:ind w:firstLine="0"/>
+        <w:jc w:val="left"/>
+      </w:pPr>
+      <w:r>
+        <w:rPr>
+          <w:sz w:val="20"/>
+        </w:rPr>
+        <w:t>TARGET: docs/labs/pr12/tp/evidence/screenshots/0104-pz01-03.png</w:t>
+        <w:br/>
+        <w:t>CAPTION: Рисунок 3 — Запуск поставки вне исходного кода и IDE</w:t>
+        <w:br/>
+        <w:t>INSERT AT: docs/labs/pr12/tp/reports/0104-pz01-tp.docx: блок «Рисунок 3», заменить единственный абзац плейсхолдера для 0104-pz01-03.png. Подпись указана в CAPTION; инструкции SOURCE/STATE/COMMAND сохранить до вставки.</w:t>
+      </w:r>
+    </w:p>
+    <w:p>
+      <w:pPr>
+        <w:pStyle w:val="afa"/>
+      </w:pPr>
+      <w:r>
+        <w:t>Рисунок 4 — Штатный запуск компонента</w:t>
+      </w:r>
+    </w:p>
+    <w:p>
+      <w:pPr>
+        <w:spacing w:line="240" w:lineRule="auto" w:after="120"/>
+        <w:ind w:firstLine="0"/>
+        <w:jc w:val="left"/>
+      </w:pPr>
+      <w:r>
+        <w:rPr>
+          <w:sz w:val="20"/>
+        </w:rPr>
+        <w:t>[ВСТАВИТЬ РЕАЛЬНОЕ ИЗОБРАЖЕНИЕ ВРУЧНУЮ: 0104-pz01-04.png]</w:t>
+      </w:r>
+    </w:p>
+    <w:p>
+      <w:pPr>
+        <w:spacing w:line="240" w:lineRule="auto" w:after="120"/>
+        <w:ind w:firstLine="0"/>
+        <w:jc w:val="left"/>
+      </w:pPr>
+      <w:r>
+        <w:rPr>
+          <w:sz w:val="20"/>
+        </w:rPr>
+        <w:t>SOURCE: /Users/tima/Documents/Codex/2026-10-18/files-pasted-by-the-user-hitpipe/work/hitpipe/docs/labs/pr12/tp/evidence/report-refresh-20261019/accepted-delivery-outside</w:t>
+        <w:br/>
+        <w:t>STATE: PASS_RECORDED_SCOPE; main ec0dcba7ca42ea59909489cef9650c6edff12f35; CAPTURE_PENDING</w:t>
+        <w:br/>
+        <w:t>CWD: /Users/tima/Documents/Codex/2026-10-18/files-pasted-by-the-user-hitpipe/work/hit32-report-evidence/delivery-outside</w:t>
+        <w:br/>
+        <w:t>COMMAND: ./processing-release --version; ./processing-release --fixture valid.json --format json; echo $?</w:t>
+        <w:br/>
+        <w:t>STEPS: 1. Открыть новые delivery-observations.json и соответствующий журнал. 2. Для повторения использовать бинарник delivery-outside/processing-release, собранный из main, и полные synthetic fixtures рядом. 3. Выполнить команду из указанного cwd вне checkout; показать SHA/mode/result/exit. 4. Снять реальное окно терминала; не подменять его текстовым плейсхолдером.</w:t>
+      </w:r>
+    </w:p>
+    <w:p>
+      <w:pPr>
+        <w:spacing w:line="240" w:lineRule="auto" w:after="120"/>
+        <w:ind w:firstLine="0"/>
+        <w:jc w:val="left"/>
+      </w:pPr>
+      <w:r>
+        <w:rPr>
+          <w:sz w:val="20"/>
+        </w:rPr>
+        <w:t>MUST BE VISIBLE: Command, fullSHA/version/mode, safe diagnostics, result and exit0</w:t>
+        <w:br/>
+        <w:t>REDACT: Скрыть tokens/passwords/cookies, личную почту и соседние окна. Не скрывать task/SHA/command/assertion/exit. Не показывать реальные payment/customer payloads; использовать только синтетические fixtures.</w:t>
+        <w:br/>
+        <w:t xml:space="preserve">VERIFY: Сверить actual SHA ec0dcba7ca42ea59909489cef9650c6edff12f35 и CI </w:t>
+      </w:r>
+      <w:hyperlink r:id="rId12">
+        <w:r>
+          <w:rPr>
+            <w:rStyle w:val="Hyperlink"/>
+            <w:sz w:val="20"/>
+          </w:rPr>
+          <w:t>https://github.com/hitpipe/hitpipe/actions/runs/39229206910</w:t>
+        </w:r>
+      </w:hyperlink>
+      <w:r>
+        <w:rPr>
+          <w:sz w:val="20"/>
+        </w:rPr>
+        <w:t>. Placeholder не PASS. Для human gate сначала выполнить настоящую проверку с участниками/датой/своим SHA. После принятия отчётов и реальных снимков заново проверить пагинацию/оглавление; финальный tag→commit→CI записывает уполномоченный человек.</w:t>
+      </w:r>
+    </w:p>
+    <w:p>
+      <w:pPr>
+        <w:spacing w:line="240" w:lineRule="auto" w:after="120"/>
+        <w:ind w:firstLine="0"/>
+        <w:jc w:val="left"/>
+      </w:pPr>
+      <w:r>
+        <w:rPr>
+          <w:sz w:val="20"/>
+        </w:rPr>
+        <w:t>TARGET: docs/labs/pr12/tp/evidence/screenshots/0104-pz01-04.png</w:t>
+        <w:br/>
+        <w:t>CAPTION: Рисунок 4 — Штатный запуск компонента</w:t>
+        <w:br/>
+        <w:t>INSERT AT: docs/labs/pr12/tp/reports/0104-pz01-tp.docx: блок «Рисунок 4», заменить единственный абзац плейсхолдера для 0104-pz01-04.png. Подпись указана в CAPTION; инструкции SOURCE/STATE/COMMAND сохранить до вставки.</w:t>
+      </w:r>
+    </w:p>
+    <w:p>
+      <w:pPr>
+        <w:pStyle w:val="afa"/>
+      </w:pPr>
+      <w:r>
+        <w:t>Рисунок 5 — Неверная конфигурация</w:t>
+      </w:r>
+    </w:p>
+    <w:p>
+      <w:pPr>
+        <w:spacing w:line="240" w:lineRule="auto" w:after="120"/>
+        <w:ind w:firstLine="0"/>
+        <w:jc w:val="left"/>
+      </w:pPr>
+      <w:r>
+        <w:rPr>
+          <w:sz w:val="20"/>
+        </w:rPr>
+        <w:t>[ВСТАВИТЬ РЕАЛЬНОЕ ИЗОБРАЖЕНИЕ ВРУЧНУЮ: 0104-pz01-05.png]</w:t>
+      </w:r>
+    </w:p>
+    <w:p>
+      <w:pPr>
+        <w:spacing w:line="240" w:lineRule="auto" w:after="120"/>
+        <w:ind w:firstLine="0"/>
+        <w:jc w:val="left"/>
+      </w:pPr>
+      <w:r>
+        <w:rPr>
+          <w:sz w:val="20"/>
+        </w:rPr>
+        <w:t>SOURCE: /Users/tima/Documents/Codex/2026-10-18/files-pasted-by-the-user-hitpipe/work/hitpipe/docs/labs/pr12/tp/evidence/report-refresh-20261019/accepted-delivery-outside</w:t>
+        <w:br/>
+        <w:t>STATE: PASS_RECORDED_SCOPE; main ec0dcba7ca42ea59909489cef9650c6edff12f35; CAPTURE_PENDING</w:t>
+        <w:br/>
+        <w:t>CWD: /Users/tima/Documents/Codex/2026-10-18/files-pasted-by-the-user-hitpipe/work/hit32-report-evidence/delivery-outside</w:t>
+        <w:br/>
+        <w:t>COMMAND: ./processing-release --version; ./processing-release --fixture invalid.json --format json; echo $?</w:t>
+        <w:br/>
+        <w:t>STEPS: 1. Открыть новые delivery-observations.json и соответствующий журнал. 2. Для повторения использовать бинарник delivery-outside/processing-release, собранный из main, и полные synthetic fixtures рядом. 3. Выполнить команду из указанного cwd вне checkout; показать SHA/mode/result/exit. 4. Снять реальное окно терминала; не подменять его текстовым плейсхолдером.</w:t>
+      </w:r>
+    </w:p>
+    <w:p>
+      <w:pPr>
+        <w:spacing w:line="240" w:lineRule="auto" w:after="120"/>
+        <w:ind w:firstLine="0"/>
+        <w:jc w:val="left"/>
+      </w:pPr>
+      <w:r>
+        <w:rPr>
+          <w:sz w:val="20"/>
+        </w:rPr>
+        <w:t>MUST BE VISIBLE: Same version, command, safe error, exit2</w:t>
+        <w:br/>
+        <w:t>REDACT: Скрыть tokens/passwords/cookies, личную почту и соседние окна. Не скрывать task/SHA/command/assertion/exit. Не показывать реальные payment/customer payloads; использовать только синтетические fixtures.</w:t>
+        <w:br/>
+        <w:t xml:space="preserve">VERIFY: Сверить actual SHA ec0dcba7ca42ea59909489cef9650c6edff12f35 и CI </w:t>
+      </w:r>
+      <w:hyperlink r:id="rId12">
+        <w:r>
+          <w:rPr>
+            <w:rStyle w:val="Hyperlink"/>
+            <w:sz w:val="20"/>
+          </w:rPr>
+          <w:t>https://github.com/hitpipe/hitpipe/actions/runs/39229206910</w:t>
+        </w:r>
+      </w:hyperlink>
+      <w:r>
+        <w:rPr>
+          <w:sz w:val="20"/>
+        </w:rPr>
+        <w:t>. Placeholder не PASS. Для human gate сначала выполнить настоящую проверку с участниками/датой/своим SHA. После принятия отчётов и реальных снимков заново проверить пагинацию/оглавление; финальный tag→commit→CI записывает уполномоченный человек.</w:t>
+      </w:r>
+    </w:p>
+    <w:p>
+      <w:pPr>
+        <w:spacing w:line="240" w:lineRule="auto" w:after="120"/>
+        <w:ind w:firstLine="0"/>
+        <w:jc w:val="left"/>
+      </w:pPr>
+      <w:r>
+        <w:rPr>
+          <w:sz w:val="20"/>
+        </w:rPr>
+        <w:t>TARGET: docs/labs/pr12/tp/evidence/screenshots/0104-pz01-05.png</w:t>
+        <w:br/>
+        <w:t>CAPTION: Рисунок 5 — Неверная конфигурация</w:t>
+        <w:br/>
+        <w:t>INSERT AT: docs/labs/pr12/tp/reports/0104-pz01-tp.docx: блок «Рисунок 5», заменить единственный абзац плейсхолдера для 0104-pz01-05.png. Подпись указана в CAPTION; инструкции SOURCE/STATE/COMMAND сохранить до вставки.</w:t>
+      </w:r>
+    </w:p>
+    <w:p>
+      <w:pPr>
+        <w:pStyle w:val="afa"/>
+      </w:pPr>
+      <w:r>
+        <w:t>Рисунок 6 — Независимое воспроизведение части другого студента</w:t>
+      </w:r>
+    </w:p>
+    <w:p>
+      <w:pPr>
+        <w:spacing w:line="240" w:lineRule="auto" w:after="120"/>
+        <w:ind w:firstLine="0"/>
+        <w:jc w:val="left"/>
+      </w:pPr>
+      <w:r>
+        <w:rPr>
+          <w:sz w:val="20"/>
+        </w:rPr>
+        <w:t>[ВСТАВИТЬ РЕАЛЬНОЕ ИЗОБРАЖЕНИЕ ВРУЧНУЮ: 0104-pz01-06.png]</w:t>
+      </w:r>
+    </w:p>
+    <w:p>
+      <w:pPr>
+        <w:spacing w:line="240" w:lineRule="auto" w:after="120"/>
+        <w:ind w:firstLine="0"/>
+        <w:jc w:val="left"/>
+      </w:pPr>
+      <w:r>
+        <w:rPr>
+          <w:sz w:val="20"/>
+        </w:rPr>
+        <w:t>SOURCE: /Users/tima/Documents/Codex/2026-10-18/files-pasted-by-the-user-hitpipe/work/hitpipe/docs/labs/pr12/tp/human-gates/peer-scaffold-out.md</w:t>
+        <w:br/>
+        <w:t>STATE: HUMAN_PENDING</w:t>
+        <w:br/>
+        <w:t>CWD: Не определён до получения реального чужого артефакта; записывает фактический проверяющий</w:t>
+        <w:br/>
+        <w:t>COMMAND: Применить реальные команды полученного чужого артефакта; exact SHA и окружение фиксирует действительный проверяющий. До получения артефакта команда не выполнена.</w:t>
+        <w:br/>
+        <w:t>STEPS: 1. Lead получает настоящее назначение/чужой пакет. 2. Назначенный человек выполняет предусмотренную проверку и записывает дату, роль, exact чужой SHA, cwd/env/commands/results/remarks/retest. 3. Только после этого открыть заполненный протокол и сделать настоящий снимок. 4. Codex по поручению Lead не выдавать за личную проверку студента; текущий placeholder не свидетельствует о выполнении.</w:t>
+      </w:r>
+    </w:p>
+    <w:p>
+      <w:pPr>
+        <w:spacing w:line="240" w:lineRule="auto" w:after="120"/>
+        <w:ind w:firstLine="0"/>
+        <w:jc w:val="left"/>
+      </w:pPr>
+      <w:r>
+        <w:rPr>
+          <w:sz w:val="20"/>
+        </w:rPr>
+        <w:t>MUST BE VISIBLE: Реальный проверяющий и другой автор, дата/env/foreignSHA/cwd/commands/results/remarks/retest</w:t>
+        <w:br/>
+        <w:t>REDACT: Скрыть tokens/passwords/cookies, личную почту и соседние окна. Не скрывать task/SHA/command/assertion/exit. Не показывать реальные payment/customer payloads; использовать только синтетические fixtures.</w:t>
+        <w:br/>
+        <w:t>VERIFY: Сначала реальный human gate. Фиксировать actual чужой SHA/CI/env/cwd/commands/дату/проверяющего и результат; их нельзя заменить собственным Processing SHA. Собственная reference ec0dcba7ca42ea59909489cef9650c6edff12f35. После вставки снимков обновить пагинацию/оглавление. Placeholder не PASS.</w:t>
+      </w:r>
+    </w:p>
+    <w:p>
+      <w:pPr>
+        <w:spacing w:line="240" w:lineRule="auto" w:after="120"/>
+        <w:ind w:firstLine="0"/>
+        <w:jc w:val="left"/>
+      </w:pPr>
+      <w:r>
+        <w:rPr>
+          <w:sz w:val="20"/>
+        </w:rPr>
+        <w:t>TARGET: docs/labs/pr12/tp/evidence/screenshots/0104-pz01-06.png</w:t>
+        <w:br/>
+        <w:t>CAPTION: Рисунок 6 — Независимое воспроизведение части другого студента</w:t>
+        <w:br/>
+        <w:t>INSERT AT: docs/labs/pr12/tp/reports/0104-pz01-tp.docx: блок «Рисунок 6», заменить единственный абзац плейсхолдера для 0104-pz01-06.png. Подпись указана в CAPTION; инструкции SOURCE/STATE/COMMAND сохранить до вставки.</w:t>
+      </w:r>
+    </w:p>
+    <w:p>
+      <w:pPr>
+        <w:pStyle w:val="afa"/>
+      </w:pPr>
+      <w:r>
+        <w:t>Рисунок 7 — Отрицательная локальная проверка автоматического gate</w:t>
+      </w:r>
+    </w:p>
+    <w:p>
+      <w:pPr>
+        <w:spacing w:line="240" w:lineRule="auto" w:after="120"/>
+        <w:ind w:firstLine="0"/>
+        <w:jc w:val="left"/>
+      </w:pPr>
+      <w:r>
+        <w:rPr>
+          <w:sz w:val="20"/>
+        </w:rPr>
+        <w:t>[ВСТАВИТЬ РЕАЛЬНОЕ ИЗОБРАЖЕНИЕ ВРУЧНУЮ: 0104-pz01-07.png]</w:t>
+      </w:r>
+    </w:p>
+    <w:p>
+      <w:pPr>
+        <w:spacing w:line="240" w:lineRule="auto" w:after="120"/>
+        <w:ind w:firstLine="0"/>
+        <w:jc w:val="left"/>
+      </w:pPr>
+      <w:r>
+        <w:rPr>
+          <w:sz w:val="20"/>
+        </w:rPr>
+        <w:t>SOURCE: /Users/tima/Documents/Codex/2026-10-18/files-pasted-by-the-user-hitpipe/work/hitpipe/docs/labs/pr12/tp/evidence/report-refresh-20261019/accepted-mutations/negative-gate.log</w:t>
+        <w:br/>
+        <w:t>STATE: PASS_RECORDED_SCOPE; main ec0dcba7ca42ea59909489cef9650c6edff12f35; CAPTURE_PENDING</w:t>
+        <w:br/>
+        <w:t>CWD: /Users/tima/Documents/Codex/2026-10-18/files-pasted-by-the-user-hitpipe/work/hit32-accepted-main</w:t>
+        <w:br/>
+        <w:t xml:space="preserve">COMMAND: export PATH=/Users/tima/Documents/Codex/2026-10-18/files-pasted-by-the-user-hitpipe/work/go/bin:$PATH; go version; git rev-parse HEAD; python3 services/processing/tools/mutations/run.py --output .pr12-build/figure-mutations --natural-defects 2 --natural-defect-task </w:t>
       </w:r>
       <w:hyperlink r:id="rId14">
         <w:r>
           <w:rPr>
             <w:rStyle w:val="Hyperlink"/>
+            <w:sz w:val="20"/>
           </w:rPr>
-          <w:t>https://github.com/hitpipe/hitpipe/blob/4a2bfcdd9bf7656a8d5c55963750b8aecf186fb0/services/processing/cmd/processing-contractcheck/main.go</w:t>
+          <w:t>https://hitpipe.atlassian.net/browse/HIT-29</w:t>
         </w:r>
       </w:hyperlink>
       <w:r>
-        <w:br/>
-        <w:t>STATE: SOURCE 4a2bfcdd9bf7656a8d5c55963750b8aecf186fb0</w:t>
-        <w:br/>
-        <w:t>CWD: /Users/tima/Documents/Codex/2026-10-18/files-pasted-by-the-user-hitpipe/work/figure-source</w:t>
-        <w:br/>
-        <w:t>COMMAND: git show 4a2bfcdd9bf7656a8d5c55963750b8aecf186fb0:services/processing/cmd/processing-contractcheck/main.go</w:t>
-        <w:br/>
-        <w:t>STEPS: 1. Открыть exact GitHub file либо редактор clean checkout. 2. Найти var version/commit/dirty/buildMode, flag fixture/format и run. 3. Показать собственный parser/diagnostic/composition фрагмент и Task HIT-27/PR5.</w:t>
-      </w:r>
-    </w:p>
-    <w:p>
-      <w:r>
-        <w:t>MUST BE VISIBLE: File path, SHA, metadata, config selection, safe output/error handling</w:t>
-        <w:br/>
-        <w:t>REDACT: Скрыть tokens/passwords/cookies, личную почту и соседние окна. Не скрывать task/SHA/command/assertion/exit. Не показывать реальные payment/customer payloads; использовать только синтетические fixtures.</w:t>
-        <w:br/>
-        <w:t>VERIFY: Проверить полный фактический SHA и actual status. Исторические источники выше не выданы за merged/tagged submission. После human merge/tag использовать внешнюю submission record, повторить проверки на сдаваемом SHA и актуализировать версии; pending human gate сначала реально выполнить. Placeholder не evidence PASS.</w:t>
-      </w:r>
-    </w:p>
-    <w:p>
-      <w:r>
-        <w:t>TARGET: docs/labs/pr12/tp/evidence/screenshots/0104-pz01-01.png</w:t>
-        <w:br/>
-        <w:t>CAPTION: Рисунок 1 — Собственная часть исполняемого каркаса</w:t>
-        <w:br/>
-        <w:t>INSERT AT: docs/labs/pr12/tp/reports/0104-pz01-tp.docx, приложение инструкций, после заголовка Рисунок 1; ссылка из соответствующего раздела основного текста</w:t>
-      </w:r>
-    </w:p>
-    <w:p>
-      <w:pPr>
-        <w:pStyle w:val="afa"/>
-      </w:pPr>
-      <w:r>
-        <w:t>Рисунок 2 — Подготовка компонента в двух режимах</w:t>
-      </w:r>
-    </w:p>
-    <w:p>
-      <w:r>
-        <w:t>[ВСТАВИТЬ РЕАЛЬНОЕ ИЗОБРАЖЕНИЕ ВРУЧНУЮ: 0104-pz01-02.png]</w:t>
-      </w:r>
-    </w:p>
-    <w:p>
-      <w:r>
-        <w:t>SOURCE: /Users/tima/Documents/Codex/2026-10-18/files-pasted-by-the-user-hitpipe/work/hitpipe/docs/labs/pr12/tp/evidence/d1/record.json</w:t>
-        <w:br/>
-        <w:t>STATE: PASS build 8ae5d67b9eb0f4ffc729a270c2ee14e1c052b0cb</w:t>
-        <w:br/>
-        <w:t>CWD: /Users/tima/Documents/Codex/2026-10-18/files-pasted-by-the-user-hitpipe/work/figure-delivery</w:t>
-        <w:br/>
-        <w:t>COMMAND: export PATH=/Users/tima/Documents/Codex/2026-10-18/files-pasted-by-the-user-hitpipe/work/go/bin:$PATH; go version; git rev-parse HEAD; python3 tools/pr12/workspace.py build processing --mode dev --require; python3 tools/pr12/workspace.py build processing --mode release --require</w:t>
-        <w:br/>
-        <w:t>STEPS: 1. Открыть terminal exact source8ae5 и показать fullSHA/Go1.27.2. 2. Выполнить обе команды. 3. Раскрыть actual flags -N -l и -trimpath, linker metadata. 4. Показать exit0 каждого; размеры из delivery-observations.json.</w:t>
-      </w:r>
-    </w:p>
-    <w:p>
-      <w:r>
-        <w:t>MUST BE VISIBLE: Both commands and flags, modes, same source SHA, exit0</w:t>
-        <w:br/>
-        <w:t>REDACT: Скрыть tokens/passwords/cookies, личную почту и соседние окна. Не скрывать task/SHA/command/assertion/exit. Не показывать реальные payment/customer payloads; использовать только синтетические fixtures.</w:t>
-        <w:br/>
-        <w:t>VERIFY: Проверить полный фактический SHA и actual status. Исторические источники выше не выданы за merged/tagged submission. После human merge/tag использовать внешнюю submission record, повторить проверки на сдаваемом SHA и актуализировать версии; pending human gate сначала реально выполнить. Placeholder не evidence PASS.</w:t>
-      </w:r>
-    </w:p>
-    <w:p>
-      <w:r>
-        <w:t>TARGET: docs/labs/pr12/tp/evidence/screenshots/0104-pz01-02.png</w:t>
-        <w:br/>
-        <w:t>CAPTION: Рисунок 2 — Подготовка компонента в двух режимах</w:t>
-        <w:br/>
-        <w:t>INSERT AT: docs/labs/pr12/tp/reports/0104-pz01-tp.docx, приложение инструкций, после заголовка Рисунок 2; ссылка из соответствующего раздела основного текста</w:t>
-      </w:r>
-    </w:p>
-    <w:p>
-      <w:pPr>
-        <w:pStyle w:val="afa"/>
-      </w:pPr>
-      <w:r>
-        <w:t>Рисунок 3 — Запуск поставки вне исходного кода и IDE</w:t>
-      </w:r>
-    </w:p>
-    <w:p>
-      <w:r>
-        <w:t>[ВСТАВИТЬ РЕАЛЬНОЕ ИЗОБРАЖЕНИЕ ВРУЧНУЮ: 0104-pz01-03.png]</w:t>
-      </w:r>
-    </w:p>
-    <w:p>
-      <w:r>
-        <w:t>SOURCE: /Users/tima/Documents/Codex/2026-10-18/files-pasted-by-the-user-hitpipe/work/hitpipe/docs/labs/pr12/tp/evidence/d1/delivery-observations.json</w:t>
-        <w:br/>
-        <w:t>STATE: PASS outside checkout 8ae5d67b9eb0f4ffc729a270c2ee14e1c052b0cb</w:t>
-        <w:br/>
-        <w:t>CWD: repo root затем отдельный каталог вне checkout</w:t>
-        <w:br/>
-        <w:t>COMMAND: export PATH=/Users/tima/Documents/Codex/2026-10-18/files-pasted-by-the-user-hitpipe/work/go/bin:$PATH; python3 tools/pr12/workspace.py build processing --mode release --require; TP_DELIVERY_DIR=$(mktemp -d /tmp/tp-delivery.XXXXXX); cp .pr12-build/processing/release/processing-contractcheck services/processing/testdata/valid.json "$TP_DELIVERY_DIR/"; cd "$TP_DELIVERY_DIR"; pwd; ./processing-contractcheck --version; ./processing-contractcheck --fixture valid.json --format json; echo $?</w:t>
-        <w:br/>
-        <w:t>STEPS: 1. Выполнить smoke: он собирает оба режима и копирует binary+fixtures во временный каталог. 2. В выводе показать пути pr12-outside-checkout, invocation --version и --fixture. 3. Для ручной демонстрации скопировать release binary и valid.json в новый пустой каталог, перейти туда. 4. Запустить ./processing-contractcheck --version, затем --fixture valid.json --format json и echo $?.</w:t>
-      </w:r>
-    </w:p>
-    <w:p>
-      <w:r>
-        <w:t>MUST BE VISIBLE: Cwd вне source, binary/version/sourceSHA, declared files, VALID exit0</w:t>
-        <w:br/>
-        <w:t>REDACT: Скрыть tokens/passwords/cookies, личную почту и соседние окна. Не скрывать task/SHA/command/assertion/exit. Не показывать реальные payment/customer payloads; использовать только синтетические fixtures.</w:t>
-        <w:br/>
-        <w:t>VERIFY: Проверить полный фактический SHA и actual status. Исторические источники выше не выданы за merged/tagged submission. После human merge/tag использовать внешнюю submission record, повторить проверки на сдаваемом SHA и актуализировать версии; pending human gate сначала реально выполнить. Placeholder не evidence PASS.</w:t>
-      </w:r>
-    </w:p>
-    <w:p>
-      <w:r>
-        <w:t>TARGET: docs/labs/pr12/tp/evidence/screenshots/0104-pz01-03.png</w:t>
-        <w:br/>
-        <w:t>CAPTION: Рисунок 3 — Запуск поставки вне исходного кода и IDE</w:t>
-        <w:br/>
-        <w:t>INSERT AT: docs/labs/pr12/tp/reports/0104-pz01-tp.docx, приложение инструкций, после заголовка Рисунок 3; ссылка из соответствующего раздела основного текста</w:t>
-      </w:r>
-    </w:p>
-    <w:p>
-      <w:pPr>
-        <w:pStyle w:val="afa"/>
-      </w:pPr>
-      <w:r>
-        <w:t>Рисунок 4 — Штатный запуск компонента</w:t>
-      </w:r>
-    </w:p>
-    <w:p>
-      <w:r>
-        <w:t>[ВСТАВИТЬ РЕАЛЬНОЕ ИЗОБРАЖЕНИЕ ВРУЧНУЮ: 0104-pz01-04.png]</w:t>
-      </w:r>
-    </w:p>
-    <w:p>
-      <w:r>
-        <w:t>SOURCE: /Users/tima/Documents/Codex/2026-10-18/files-pasted-by-the-user-hitpipe/work/hitpipe/docs/labs/pr12/tp/evidence/d1/release-normal.log</w:t>
-        <w:br/>
-        <w:t>STATE: PASS 8ae5d67b9eb0f4ffc729a270c2ee14e1c052b0cb</w:t>
-        <w:br/>
-        <w:t>CWD: /Users/tima/Documents/Codex/2026-10-18/files-pasted-by-the-user-hitpipe/work/figure-delivery</w:t>
-        <w:br/>
-        <w:t>COMMAND: export PATH=/Users/tima/Documents/Codex/2026-10-18/files-pasted-by-the-user-hitpipe/work/go/bin:$PATH; go version; git rev-parse HEAD; .pr12-build/processing/release/processing-contractcheck --version; .pr12-build/processing/release/processing-contractcheck --fixture services/processing/testdata/valid.json --format json; echo $?</w:t>
-        <w:br/>
-        <w:t>STEPS: 1. Собрать release exact source как на рисунке2. 2. Выполнить указанные version и fixture команды. 3. Оставить start/result, VALID/FINANCIAL_ELIGIBILITY_ONLY и exit0 в кадре.</w:t>
-      </w:r>
-    </w:p>
-    <w:p>
-      <w:r>
-        <w:t>MUST BE VISIBLE: Command, fullSHA/version/mode, safe diagnostics, result and exit0</w:t>
-        <w:br/>
-        <w:t>REDACT: Скрыть tokens/passwords/cookies, личную почту и соседние окна. Не скрывать task/SHA/command/assertion/exit. Не показывать реальные payment/customer payloads; использовать только синтетические fixtures.</w:t>
-        <w:br/>
-        <w:t>VERIFY: Проверить полный фактический SHA и actual status. Исторические источники выше не выданы за merged/tagged submission. После human merge/tag использовать внешнюю submission record, повторить проверки на сдаваемом SHA и актуализировать версии; pending human gate сначала реально выполнить. Placeholder не evidence PASS.</w:t>
-      </w:r>
-    </w:p>
-    <w:p>
-      <w:r>
-        <w:t>TARGET: docs/labs/pr12/tp/evidence/screenshots/0104-pz01-04.png</w:t>
-        <w:br/>
-        <w:t>CAPTION: Рисунок 4 — Штатный запуск компонента</w:t>
-        <w:br/>
-        <w:t>INSERT AT: docs/labs/pr12/tp/reports/0104-pz01-tp.docx, приложение инструкций, после заголовка Рисунок 4; ссылка из соответствующего раздела основного текста</w:t>
-      </w:r>
-    </w:p>
-    <w:p>
-      <w:pPr>
-        <w:pStyle w:val="afa"/>
-      </w:pPr>
-      <w:r>
-        <w:t>Рисунок 5 — Неверная конфигурация</w:t>
-      </w:r>
-    </w:p>
-    <w:p>
-      <w:r>
-        <w:t>[ВСТАВИТЬ РЕАЛЬНОЕ ИЗОБРАЖЕНИЕ ВРУЧНУЮ: 0104-pz01-05.png]</w:t>
-      </w:r>
-    </w:p>
-    <w:p>
-      <w:r>
-        <w:t>SOURCE: /Users/tima/Documents/Codex/2026-10-18/files-pasted-by-the-user-hitpipe/work/hitpipe/docs/labs/pr12/tp/evidence/d1/release-invalid-config.log</w:t>
-        <w:br/>
-        <w:t>STATE: PASS expected error exit2 8ae5d67b9eb0f4ffc729a270c2ee14e1c052b0cb</w:t>
-        <w:br/>
-        <w:t>CWD: /Users/tima/Documents/Codex/2026-10-18/files-pasted-by-the-user-hitpipe/work/figure-delivery</w:t>
-        <w:br/>
-        <w:t>COMMAND: export PATH=/Users/tima/Documents/Codex/2026-10-18/files-pasted-by-the-user-hitpipe/work/go/bin:$PATH; go version; git rev-parse HEAD; .pr12-build/processing/release/processing-contractcheck --fixture services/processing/testdata/invalid.json --format json; echo $?</w:t>
-        <w:br/>
-        <w:t>STEPS: 1. Использовать тот же binary/source что normal. 2. Выполнить invalid command без set -e, чтобы показать exit. 3. Повторить с --format invalid при valid fixture. 4. В обоих случаях должно быть понятное INVALID_JSON/CONFIGURATION и nonzero2, без payload.</w:t>
-      </w:r>
-    </w:p>
-    <w:p>
-      <w:r>
-        <w:t>MUST BE VISIBLE: Same version, command, safe error, exit2</w:t>
-        <w:br/>
-        <w:t>REDACT: Скрыть tokens/passwords/cookies, личную почту и соседние окна. Не скрывать task/SHA/command/assertion/exit. Не показывать реальные payment/customer payloads; использовать только синтетические fixtures.</w:t>
-        <w:br/>
-        <w:t>VERIFY: Проверить полный фактический SHA и actual status. Исторические источники выше не выданы за merged/tagged submission. После human merge/tag использовать внешнюю submission record, повторить проверки на сдаваемом SHA и актуализировать версии; pending human gate сначала реально выполнить. Placeholder не evidence PASS.</w:t>
-      </w:r>
-    </w:p>
-    <w:p>
-      <w:r>
-        <w:t>TARGET: docs/labs/pr12/tp/evidence/screenshots/0104-pz01-05.png</w:t>
-        <w:br/>
-        <w:t>CAPTION: Рисунок 5 — Неверная конфигурация</w:t>
-        <w:br/>
-        <w:t>INSERT AT: docs/labs/pr12/tp/reports/0104-pz01-tp.docx, приложение инструкций, после заголовка Рисунок 5; ссылка из соответствующего раздела основного текста</w:t>
-      </w:r>
-    </w:p>
-    <w:p>
-      <w:pPr>
-        <w:pStyle w:val="afa"/>
-      </w:pPr>
-      <w:r>
-        <w:t>Рисунок 6 — Независимое воспроизведение части другого студента</w:t>
-      </w:r>
-    </w:p>
-    <w:p>
-      <w:r>
-        <w:t>[ВСТАВИТЬ РЕАЛЬНОЕ ИЗОБРАЖЕНИЕ ВРУЧНУЮ: 0104-pz01-06.png]</w:t>
-      </w:r>
-    </w:p>
-    <w:p>
-      <w:r>
-        <w:t>SOURCE: /Users/tima/Documents/Codex/2026-10-18/files-pasted-by-the-user-hitpipe/work/hitpipe/docs/labs/pr12/tp/human-gates/peer-scaffold-out.md</w:t>
-        <w:br/>
-        <w:t>STATE: HUMAN_PENDING</w:t>
-        <w:br/>
-        <w:t>CWD: не применяется до получения foreign exact artifact</w:t>
-        <w:br/>
-        <w:t>COMMAND: Команды именно из actual README исполнителя HIT-13; Processing commands ему не приписываются</w:t>
-        <w:br/>
-        <w:t>STEPS: 1. Lead получает чужой UX scaffold SHA/README. 2. Тимофей лично готовит clean environment только по нему, фиксирует env/fullSHA. 3. Исполняет объявленные build/version/config/diagnostic commands, сохраняет own results/remarks. 4. После actual retest открыть протокол и terminal; сделать ручной снимок. 5. Отдельно получить incoming check от HIT-11.</w:t>
-      </w:r>
-    </w:p>
-    <w:p>
-      <w:r>
-        <w:t>MUST BE VISIBLE: Реальный проверяющий и другой автор, дата/env/foreignSHA/cwd/commands/results/remarks/retest</w:t>
-        <w:br/>
-        <w:t>REDACT: Скрыть tokens/passwords/cookies, личную почту и соседние окна. Не скрывать task/SHA/command/assertion/exit. Не показывать реальные payment/customer payloads; использовать только синтетические fixtures.</w:t>
-        <w:br/>
-        <w:t>VERIFY: Проверить полный фактический SHA и actual status. Исторические источники выше не выданы за merged/tagged submission. После human merge/tag использовать внешнюю submission record, повторить проверки на сдаваемом SHA и актуализировать версии; pending human gate сначала реально выполнить. Placeholder не evidence PASS.</w:t>
-      </w:r>
-    </w:p>
-    <w:p>
-      <w:r>
-        <w:t>TARGET: docs/labs/pr12/tp/evidence/screenshots/0104-pz01-06.png</w:t>
-        <w:br/>
-        <w:t>CAPTION: Рисунок 6 — Независимое воспроизведение части другого студента</w:t>
-        <w:br/>
-        <w:t>INSERT AT: docs/labs/pr12/tp/reports/0104-pz01-tp.docx, приложение инструкций, после заголовка Рисунок 6; ссылка из соответствующего раздела основного текста</w:t>
-      </w:r>
-    </w:p>
-    <w:p>
-      <w:pPr>
-        <w:pStyle w:val="afa"/>
-      </w:pPr>
-      <w:r>
-        <w:t>Рисунок 7 — Отрицательная локальная проверка автоматического gate</w:t>
-      </w:r>
-    </w:p>
-    <w:p>
-      <w:r>
-        <w:t>[ВСТАВИТЬ РЕАЛЬНОЕ ИЗОБРАЖЕНИЕ ВРУЧНУЮ: 0104-pz01-07.png]</w:t>
-      </w:r>
-    </w:p>
-    <w:p>
-      <w:r>
-        <w:t>SOURCE: /Users/tima/Documents/Codex/2026-10-18/files-pasted-by-the-user-hitpipe/work/hitpipe/docs/labs/pr12/tp/evidence/mutations/negative-gate.log</w:t>
-        <w:br/>
-        <w:t>STATE: PASS sensitivity: expected nonzero on M01; restored PASS</w:t>
-        <w:br/>
-        <w:t>CWD: /Users/tima/Documents/Codex/2026-10-18/files-pasted-by-the-user-hitpipe/work/figure-source</w:t>
-        <w:br/>
-        <w:t xml:space="preserve">COMMAND: export PATH=/Users/tima/Documents/Codex/2026-10-18/files-pasted-by-the-user-hitpipe/work/go/bin:$PATH; go version; git rev-parse HEAD; python3 services/processing/tools/mutations/run.py --output .pr12-build/figure-mutations --natural-defects 1 --natural-defect-task </w:t>
+        <w:rPr>
+          <w:sz w:val="20"/>
+        </w:rPr>
+        <w:t xml:space="preserve"> --natural-defect-task </w:t>
       </w:r>
       <w:hyperlink r:id="rId15">
         <w:r>
           <w:rPr>
             <w:rStyle w:val="Hyperlink"/>
+            <w:sz w:val="20"/>
           </w:rPr>
-          <w:t>https://hitpipe.atlassian.net/browse/HIT-29</w:t>
+          <w:t>https://hitpipe.atlassian.net/browse/HIT-27</w:t>
         </w:r>
       </w:hyperlink>
       <w:r>
+        <w:rPr>
+          <w:sz w:val="20"/>
+        </w:rPr>
         <w:br/>
-        <w:t>STEPS: 1. Запустить mutation runner в exact clean checkout или открыть сохранённые logs. 2. Показать M01.patch (refund condition changed) и build exit0. 3. Открыть negative-gate.log: python3 tools/pr12/workspace.py check processing --require действительно nonzero из refund assertion. 4. Показать summary negative_gate.exit и restored.exit0/clean=true.</w:t>
+        <w:t>STEPS: 1. Открыть сохранённые M01.patch, M01-build.log, negative-gate.log и summary.json нового опыта. 2. Показать build exit 0, wrapper exit 1 из-за failing assertion и полный source SHA. 3. Restored exit 0/clean=true показать отдельно. 4. Если нужен новый запуск, команда создаёт disposable worktree; не менять основной checkout.</w:t>
       </w:r>
     </w:p>
     <w:p>
-      <w:r>
+      <w:pPr>
+        <w:spacing w:line="240" w:lineRule="auto" w:after="120"/>
+        <w:ind w:firstLine="0"/>
+        <w:jc w:val="left"/>
+      </w:pPr>
+      <w:r>
+        <w:rPr>
+          <w:sz w:val="20"/>
+        </w:rPr>
         <w:t>MUST BE VISIBLE: Exactly same CI wrapper, violated condition, real assertion FAIL/nonzero, restoration</w:t>
         <w:br/>
         <w:t>REDACT: Скрыть tokens/passwords/cookies, личную почту и соседние окна. Не скрывать task/SHA/command/assertion/exit. Не показывать реальные payment/customer payloads; использовать только синтетические fixtures.</w:t>
         <w:br/>
-        <w:t>VERIFY: Проверить полный фактический SHA и actual status. Исторические источники выше не выданы за merged/tagged submission. После human merge/tag использовать внешнюю submission record, повторить проверки на сдаваемом SHA и актуализировать версии; pending human gate сначала реально выполнить. Placeholder не evidence PASS.</w:t>
+        <w:t xml:space="preserve">VERIFY: Сверить actual SHA ec0dcba7ca42ea59909489cef9650c6edff12f35 и CI </w:t>
+      </w:r>
+      <w:hyperlink r:id="rId12">
+        <w:r>
+          <w:rPr>
+            <w:rStyle w:val="Hyperlink"/>
+            <w:sz w:val="20"/>
+          </w:rPr>
+          <w:t>https://github.com/hitpipe/hitpipe/actions/runs/39229206910</w:t>
+        </w:r>
+      </w:hyperlink>
+      <w:r>
+        <w:rPr>
+          <w:sz w:val="20"/>
+        </w:rPr>
+        <w:t>. Placeholder не PASS. Для human gate сначала выполнить настоящую проверку с участниками/датой/своим SHA. После принятия отчётов и реальных снимков заново проверить пагинацию/оглавление; финальный tag→commit→CI записывает уполномоченный человек.</w:t>
       </w:r>
     </w:p>
     <w:p>
-      <w:r>
+      <w:pPr>
+        <w:spacing w:line="240" w:lineRule="auto" w:after="120"/>
+        <w:ind w:firstLine="0"/>
+        <w:jc w:val="left"/>
+      </w:pPr>
+      <w:r>
+        <w:rPr>
+          <w:sz w:val="20"/>
+        </w:rPr>
         <w:t>TARGET: docs/labs/pr12/tp/evidence/screenshots/0104-pz01-07.png</w:t>
         <w:br/>
         <w:t>CAPTION: Рисунок 7 — Отрицательная локальная проверка автоматического gate</w:t>
         <w:br/>
-        <w:t>INSERT AT: docs/labs/pr12/tp/reports/0104-pz01-tp.docx, приложение инструкций, после заголовка Рисунок 7; ссылка из соответствующего раздела основного текста</w:t>
+        <w:t>INSERT AT: docs/labs/pr12/tp/reports/0104-pz01-tp.docx: блок «Рисунок 7», заменить единственный абзац плейсхолдера для 0104-pz01-07.png. Подпись указана в CAPTION; инструкции SOURCE/STATE/COMMAND сохранить до вставки.</w:t>
       </w:r>
     </w:p>
     <w:sectPr>

</xml_diff>